<commit_message>
Finished AI lab 2 and started lab 3
</commit_message>
<xml_diff>
--- a/МиСИИ/LB2/МиСИИ_Смирнов_Б.В._Лабораторная_работа_№1.docx
+++ b/МиСИИ/LB2/МиСИИ_Смирнов_Б.В._Лабораторная_работа_№1.docx
@@ -1,18 +1,12 @@
 
 <file path=word/document.xml><?xml version="1.0" encoding="utf-8"?>
-<w:document xmlns:wpc="http://schemas.microsoft.com/office/word/2010/wordprocessingCanvas" xmlns:cx="http://schemas.microsoft.com/office/drawing/2014/chartex" xmlns:cx1="http://schemas.microsoft.com/office/drawing/2015/9/8/chartex" xmlns:cx2="http://schemas.microsoft.com/office/drawing/2015/10/21/chartex" xmlns:cx3="http://schemas.microsoft.com/office/drawing/2016/5/9/chartex" xmlns:cx4="http://schemas.microsoft.com/office/drawing/2016/5/10/chartex" xmlns:cx5="http://schemas.microsoft.com/office/drawing/2016/5/11/chartex" xmlns:cx6="http://schemas.microsoft.com/office/drawing/2016/5/12/chartex" xmlns:cx7="http://schemas.microsoft.com/office/drawing/2016/5/13/chartex" xmlns:cx8="http://schemas.microsoft.com/office/drawing/2016/5/14/chartex" xmlns:mc="http://schemas.openxmlformats.org/markup-compatibility/2006" xmlns:aink="http://schemas.microsoft.com/office/drawing/2016/ink" xmlns:am3d="http://schemas.microsoft.com/office/drawing/2017/model3d" xmlns:o="urn:schemas-microsoft-com:office:office" xmlns:r="http://schemas.openxmlformats.org/officeDocument/2006/relationships" xmlns:m="http://schemas.openxmlformats.org/officeDocument/2006/math" xmlns:v="urn:schemas-microsoft-com:vml" xmlns:wp14="http://schemas.microsoft.com/office/word/2010/wordprocessingDrawing" xmlns:wp="http://schemas.openxmlformats.org/drawingml/2006/wordprocessingDrawing" xmlns:w10="urn:schemas-microsoft-com:office:word" xmlns:w="http://schemas.openxmlformats.org/wordprocessingml/2006/main" xmlns:w14="http://schemas.microsoft.com/office/word/2010/wordml" xmlns:w15="http://schemas.microsoft.com/office/word/2012/wordml" xmlns:w16cex="http://schemas.microsoft.com/office/word/2018/wordml/cex" xmlns:w16cid="http://schemas.microsoft.com/office/word/2016/wordml/cid" xmlns:w16="http://schemas.microsoft.com/office/word/2018/wordml" xmlns:w16sdtdh="http://schemas.microsoft.com/office/word/2020/wordml/sdtdatahash" xmlns:w16se="http://schemas.microsoft.com/office/word/2015/wordml/symex" xmlns:wpg="http://schemas.microsoft.com/office/word/2010/wordprocessingGroup" xmlns:wpi="http://schemas.microsoft.com/office/word/2010/wordprocessingInk" xmlns:wne="http://schemas.microsoft.com/office/word/2006/wordml" xmlns:wps="http://schemas.microsoft.com/office/word/2010/wordprocessingShape" mc:Ignorable="w14 w15 w16se w16cid w16 w16cex w16sdtdh wp14">
+<w:document xmlns:wpc="http://schemas.microsoft.com/office/word/2010/wordprocessingCanvas" xmlns:cx="http://schemas.microsoft.com/office/drawing/2014/chartex" xmlns:cx1="http://schemas.microsoft.com/office/drawing/2015/9/8/chartex" xmlns:cx2="http://schemas.microsoft.com/office/drawing/2015/10/21/chartex" xmlns:cx3="http://schemas.microsoft.com/office/drawing/2016/5/9/chartex" xmlns:cx4="http://schemas.microsoft.com/office/drawing/2016/5/10/chartex" xmlns:cx5="http://schemas.microsoft.com/office/drawing/2016/5/11/chartex" xmlns:cx6="http://schemas.microsoft.com/office/drawing/2016/5/12/chartex" xmlns:cx7="http://schemas.microsoft.com/office/drawing/2016/5/13/chartex" xmlns:cx8="http://schemas.microsoft.com/office/drawing/2016/5/14/chartex" xmlns:mc="http://schemas.openxmlformats.org/markup-compatibility/2006" xmlns:aink="http://schemas.microsoft.com/office/drawing/2016/ink" xmlns:am3d="http://schemas.microsoft.com/office/drawing/2017/model3d" xmlns:o="urn:schemas-microsoft-com:office:office" xmlns:oel="http://schemas.microsoft.com/office/2019/extlst" xmlns:r="http://schemas.openxmlformats.org/officeDocument/2006/relationships" xmlns:m="http://schemas.openxmlformats.org/officeDocument/2006/math" xmlns:v="urn:schemas-microsoft-com:vml" xmlns:wp14="http://schemas.microsoft.com/office/word/2010/wordprocessingDrawing" xmlns:wp="http://schemas.openxmlformats.org/drawingml/2006/wordprocessingDrawing" xmlns:w10="urn:schemas-microsoft-com:office:word" xmlns:w="http://schemas.openxmlformats.org/wordprocessingml/2006/main" xmlns:w14="http://schemas.microsoft.com/office/word/2010/wordml" xmlns:w15="http://schemas.microsoft.com/office/word/2012/wordml" xmlns:w16cex="http://schemas.microsoft.com/office/word/2018/wordml/cex" xmlns:w16cid="http://schemas.microsoft.com/office/word/2016/wordml/cid" xmlns:w16="http://schemas.microsoft.com/office/word/2018/wordml" xmlns:w16du="http://schemas.microsoft.com/office/word/2023/wordml/word16du" xmlns:w16sdtdh="http://schemas.microsoft.com/office/word/2020/wordml/sdtdatahash" xmlns:w16sdtfl="http://schemas.microsoft.com/office/word/2024/wordml/sdtformatlock" xmlns:w16se="http://schemas.microsoft.com/office/word/2015/wordml/symex" xmlns:wpg="http://schemas.microsoft.com/office/word/2010/wordprocessingGroup" xmlns:wpi="http://schemas.microsoft.com/office/word/2010/wordprocessingInk" xmlns:wne="http://schemas.microsoft.com/office/word/2006/wordml" xmlns:wps="http://schemas.microsoft.com/office/word/2010/wordprocessingShape" mc:Ignorable="w14 w15 w16se w16cid w16 w16cex w16sdtdh w16sdtfl w16du wp14">
   <w:body>
     <w:p>
       <w:pPr>
         <w:pStyle w:val="a5"/>
-        <w:rPr>
-          <w:lang w:val="en-US"/>
-        </w:rPr>
-      </w:pPr>
-      <w:r>
-        <w:rPr>
-          <w:lang w:val="en-US"/>
-        </w:rPr>
+      </w:pPr>
+      <w:r>
         <w:t xml:space="preserve">2 </w:t>
       </w:r>
       <w:r>
@@ -22,9 +16,6 @@
         <w:t xml:space="preserve"> №</w:t>
       </w:r>
       <w:r>
-        <w:rPr>
-          <w:lang w:val="en-US"/>
-        </w:rPr>
         <w:t>2</w:t>
       </w:r>
     </w:p>
@@ -43,60 +34,3452 @@
       </w:r>
     </w:p>
     <w:p/>
-    <w:p>
+    <w:p/>
+    <w:p>
+      <w:pPr>
+        <w:pStyle w:val="a5"/>
+      </w:pPr>
       <w:r>
         <w:t>Цель</w:t>
       </w:r>
       <w:r>
+        <w:t xml:space="preserve"> </w:t>
+      </w:r>
+      <w:r>
+        <w:t>работы</w:t>
+      </w:r>
+    </w:p>
+    <w:p>
+      <w:pPr>
+        <w:pStyle w:val="a5"/>
+      </w:pPr>
+    </w:p>
+    <w:p>
+      <w:r>
+        <w:t>Исследование неинформированных методов поиска решений задач в пространстве состояний, приобретение навыков программирования интеллектуальных агентов, планирующих действия на основе методов слепого поиска решений задач.</w:t>
+      </w:r>
+    </w:p>
+    <w:p/>
+    <w:p>
+      <w:pPr>
+        <w:pStyle w:val="a5"/>
+      </w:pPr>
+      <w:r>
+        <w:t>Задания для выполнения</w:t>
+      </w:r>
+      <w:r>
         <w:t>:</w:t>
       </w:r>
     </w:p>
-    <w:p>
-      <w:r>
-        <w:t>Исследование неинформированных методов поиска решений задач в пространстве состояний, приобретение навыков программирования интеллектуальных агентов, планирующих действия на основе методов слепого поиска решений задач.</w:t>
-      </w:r>
-    </w:p>
     <w:p/>
     <w:p>
       <w:r>
-        <w:t>Задания для выполнения</w:t>
-      </w:r>
-      <w:r>
-        <w:t>:</w:t>
+        <w:t>Задание 1. Поиск в глубину</w:t>
+      </w:r>
+    </w:p>
+    <w:p>
+      <w:r>
+        <w:t>Вам необходимо написать полноценные универсальные функции поиска, которые помогут Пакману планировать маршруты. Помните, что поисковый узел должен содержать не только состояние, но и информацию, необходимую для восстановления пути (плана), который приводит в это состояние.</w:t>
       </w:r>
     </w:p>
     <w:p/>
     <w:p>
       <w:r>
+        <w:t>Задание 2. Поиск в ширину</w:t>
+      </w:r>
+    </w:p>
+    <w:p>
+      <w:r>
+        <w:t>Реализуйте алгоритм поиска в ширину (BFS) в функции breadthFirstSearch в файле search.py. Напишите алгоритм поиска пути на графе, который избегает повторного раскрытия вершин. Проверьте свой код так же, как и для поиска в глубину.</w:t>
+      </w:r>
+    </w:p>
+    <w:p/>
+    <w:p>
+      <w:r>
+        <w:t>Задание 3. Поиск на основе алгоритма равных цен</w:t>
+      </w:r>
+    </w:p>
+    <w:p>
+      <w:r>
+        <w:t>Реализуйте алгоритм равных цен для поиска пути на графе в функции uniformCostSearch в файле search.py. Рекомендуется просмотреть файл util.py для ознакомления с некоторыми структурами данных, которые могут быть полезны.</w:t>
+      </w:r>
+    </w:p>
+    <w:p/>
+    <w:p>
+      <w:pPr>
+        <w:pStyle w:val="a5"/>
+      </w:pPr>
+      <w:r>
         <w:t>Ход работы</w:t>
       </w:r>
-      <w:r>
-        <w:t>:</w:t>
-      </w:r>
-    </w:p>
-    <w:p>
-      <w:pPr>
-        <w:ind w:firstLine="0"/>
-        <w:rPr>
-          <w:lang w:val="en-US"/>
-        </w:rPr>
-      </w:pPr>
-    </w:p>
-    <w:p>
-      <w:pPr>
-        <w:ind w:firstLine="0"/>
-      </w:pPr>
-      <w:r>
-        <w:rPr>
-          <w:lang w:val="en-US"/>
-        </w:rPr>
+    </w:p>
+    <w:p>
+      <w:pPr>
+        <w:ind w:firstLine="0"/>
+      </w:pPr>
+      <w:r>
         <w:tab/>
       </w:r>
+    </w:p>
+    <w:p>
+      <w:r>
+        <w:lastRenderedPageBreak/>
+        <w:t>1.</w:t>
+      </w:r>
+      <w:r>
+        <w:t xml:space="preserve"> Реализация п</w:t>
+      </w:r>
+      <w:r>
+        <w:t>оиск</w:t>
+      </w:r>
+      <w:r>
+        <w:t>а</w:t>
+      </w:r>
+      <w:r>
+        <w:t xml:space="preserve"> в глубину</w:t>
+      </w:r>
+      <w:r>
+        <w:t xml:space="preserve">. </w:t>
+      </w:r>
+      <w:r>
+        <w:t xml:space="preserve">В качестве реализации в методических указаниях был указан метод с использованием стека </w:t>
+      </w:r>
+      <w:r>
+        <w:rPr>
+          <w:lang w:val="en-US"/>
+        </w:rPr>
+        <w:t>OPEN</w:t>
+      </w:r>
+      <w:r>
+        <w:t>.</w:t>
+      </w:r>
+      <w:r>
+        <w:t xml:space="preserve"> Ввиду сложностей в реализации, был выбран метод использования рекурсивного метода (Листинг 1), который запускается из главной функции (Листинг 2).</w:t>
+      </w:r>
+      <w:r>
+        <w:t xml:space="preserve"> Тесты пройдены (Рисунок 1 – </w:t>
+      </w:r>
+      <w:r>
+        <w:t>4</w:t>
+      </w:r>
+      <w:r>
+        <w:t>).</w:t>
+      </w:r>
+    </w:p>
+    <w:p>
+      <w:pPr>
+        <w:ind w:firstLine="0"/>
+      </w:pPr>
+    </w:p>
+    <w:p>
+      <w:pPr>
+        <w:ind w:firstLine="0"/>
+        <w:rPr>
+          <w:lang w:val="en-US"/>
+        </w:rPr>
+      </w:pPr>
+      <w:r>
+        <w:t>Листинг</w:t>
+      </w:r>
+      <w:r>
+        <w:rPr>
+          <w:lang w:val="en-US"/>
+        </w:rPr>
+        <w:t xml:space="preserve"> 1 </w:t>
+      </w:r>
+      <w:r>
+        <w:rPr>
+          <w:lang w:val="en-US"/>
+        </w:rPr>
+        <w:t>–</w:t>
+      </w:r>
+      <w:r>
+        <w:rPr>
+          <w:lang w:val="en-US"/>
+        </w:rPr>
+        <w:t xml:space="preserve"> </w:t>
+      </w:r>
+      <w:r>
+        <w:t>Функция</w:t>
+      </w:r>
+      <w:r>
+        <w:rPr>
+          <w:lang w:val="en-US"/>
+        </w:rPr>
+        <w:t xml:space="preserve"> </w:t>
+      </w:r>
+      <w:r>
+        <w:t>запуска</w:t>
+      </w:r>
+    </w:p>
+    <w:p>
+      <w:pPr>
+        <w:ind w:firstLine="0"/>
+        <w:rPr>
+          <w:rFonts w:ascii="Courier New" w:hAnsi="Courier New" w:cs="Courier New"/>
+          <w:sz w:val="22"/>
+          <w:lang w:val="en-US"/>
+        </w:rPr>
+      </w:pPr>
+      <w:r>
+        <w:rPr>
+          <w:rFonts w:ascii="Courier New" w:hAnsi="Courier New" w:cs="Courier New"/>
+          <w:sz w:val="22"/>
+          <w:lang w:val="en-US"/>
+        </w:rPr>
+        <w:t>def depthFirstSearch(problem):</w:t>
+      </w:r>
+    </w:p>
+    <w:p>
+      <w:pPr>
+        <w:ind w:firstLine="0"/>
+        <w:rPr>
+          <w:rFonts w:ascii="Courier New" w:hAnsi="Courier New" w:cs="Courier New"/>
+          <w:sz w:val="22"/>
+        </w:rPr>
+      </w:pPr>
+      <w:r>
+        <w:rPr>
+          <w:rFonts w:ascii="Courier New" w:hAnsi="Courier New" w:cs="Courier New"/>
+          <w:sz w:val="22"/>
+          <w:lang w:val="en-US"/>
+        </w:rPr>
+        <w:t xml:space="preserve">    </w:t>
+      </w:r>
+      <w:r>
+        <w:rPr>
+          <w:rFonts w:ascii="Courier New" w:hAnsi="Courier New" w:cs="Courier New"/>
+          <w:sz w:val="22"/>
+        </w:rPr>
+        <w:t>"""</w:t>
+      </w:r>
+    </w:p>
+    <w:p>
+      <w:pPr>
+        <w:ind w:firstLine="0"/>
+        <w:rPr>
+          <w:rFonts w:ascii="Courier New" w:hAnsi="Courier New" w:cs="Courier New"/>
+          <w:sz w:val="22"/>
+        </w:rPr>
+      </w:pPr>
+      <w:r>
+        <w:rPr>
+          <w:rFonts w:ascii="Courier New" w:hAnsi="Courier New" w:cs="Courier New"/>
+          <w:sz w:val="22"/>
+          <w:lang w:val="en-US"/>
+        </w:rPr>
+        <w:t> </w:t>
+      </w:r>
+      <w:r>
+        <w:rPr>
+          <w:rFonts w:ascii="Courier New" w:hAnsi="Courier New" w:cs="Courier New"/>
+          <w:sz w:val="22"/>
+        </w:rPr>
+        <w:t xml:space="preserve"> </w:t>
+      </w:r>
+      <w:r>
+        <w:rPr>
+          <w:rFonts w:ascii="Courier New" w:hAnsi="Courier New" w:cs="Courier New"/>
+          <w:sz w:val="22"/>
+          <w:lang w:val="en-US"/>
+        </w:rPr>
+        <w:t> </w:t>
+      </w:r>
+      <w:r>
+        <w:rPr>
+          <w:rFonts w:ascii="Courier New" w:hAnsi="Courier New" w:cs="Courier New"/>
+          <w:sz w:val="22"/>
+        </w:rPr>
+        <w:t xml:space="preserve"> </w:t>
+      </w:r>
+      <w:r>
+        <w:rPr>
+          <w:rFonts w:ascii="Courier New" w:hAnsi="Courier New" w:cs="Courier New"/>
+          <w:sz w:val="22"/>
+        </w:rPr>
+        <w:t>Поиск</w:t>
+      </w:r>
+      <w:r>
+        <w:rPr>
+          <w:rFonts w:ascii="Courier New" w:hAnsi="Courier New" w:cs="Courier New"/>
+          <w:sz w:val="22"/>
+        </w:rPr>
+        <w:t xml:space="preserve"> </w:t>
+      </w:r>
+      <w:r>
+        <w:rPr>
+          <w:rFonts w:ascii="Courier New" w:hAnsi="Courier New" w:cs="Courier New"/>
+          <w:sz w:val="22"/>
+        </w:rPr>
+        <w:t>в</w:t>
+      </w:r>
+      <w:r>
+        <w:rPr>
+          <w:rFonts w:ascii="Courier New" w:hAnsi="Courier New" w:cs="Courier New"/>
+          <w:sz w:val="22"/>
+        </w:rPr>
+        <w:t xml:space="preserve"> </w:t>
+      </w:r>
+      <w:r>
+        <w:rPr>
+          <w:rFonts w:ascii="Courier New" w:hAnsi="Courier New" w:cs="Courier New"/>
+          <w:sz w:val="22"/>
+        </w:rPr>
+        <w:t>глубину</w:t>
+      </w:r>
+      <w:r>
+        <w:rPr>
+          <w:rFonts w:ascii="Courier New" w:hAnsi="Courier New" w:cs="Courier New"/>
+          <w:sz w:val="22"/>
+        </w:rPr>
+        <w:t xml:space="preserve">. </w:t>
+      </w:r>
+    </w:p>
+    <w:p>
+      <w:pPr>
+        <w:ind w:firstLine="0"/>
+        <w:rPr>
+          <w:rFonts w:ascii="Courier New" w:hAnsi="Courier New" w:cs="Courier New"/>
+          <w:sz w:val="22"/>
+        </w:rPr>
+      </w:pPr>
+    </w:p>
+    <w:p>
+      <w:pPr>
+        <w:ind w:firstLine="0"/>
+        <w:rPr>
+          <w:rFonts w:ascii="Courier New" w:hAnsi="Courier New" w:cs="Courier New"/>
+          <w:sz w:val="22"/>
+        </w:rPr>
+      </w:pPr>
+      <w:r>
+        <w:rPr>
+          <w:rFonts w:ascii="Courier New" w:hAnsi="Courier New" w:cs="Courier New"/>
+          <w:sz w:val="22"/>
+          <w:lang w:val="en-US"/>
+        </w:rPr>
+        <w:t> </w:t>
+      </w:r>
+      <w:r>
+        <w:rPr>
+          <w:rFonts w:ascii="Courier New" w:hAnsi="Courier New" w:cs="Courier New"/>
+          <w:sz w:val="22"/>
+        </w:rPr>
+        <w:t xml:space="preserve"> </w:t>
+      </w:r>
+      <w:r>
+        <w:rPr>
+          <w:rFonts w:ascii="Courier New" w:hAnsi="Courier New" w:cs="Courier New"/>
+          <w:sz w:val="22"/>
+          <w:lang w:val="en-US"/>
+        </w:rPr>
+        <w:t> </w:t>
+      </w:r>
+      <w:r>
+        <w:rPr>
+          <w:rFonts w:ascii="Courier New" w:hAnsi="Courier New" w:cs="Courier New"/>
+          <w:sz w:val="22"/>
+        </w:rPr>
+        <w:t xml:space="preserve"> </w:t>
+      </w:r>
+      <w:r>
+        <w:rPr>
+          <w:rFonts w:ascii="Courier New" w:hAnsi="Courier New" w:cs="Courier New"/>
+          <w:sz w:val="22"/>
+        </w:rPr>
+        <w:t xml:space="preserve">Ваш алгоритм поиска должен возвращать список действий, которые </w:t>
+      </w:r>
+    </w:p>
+    <w:p>
+      <w:pPr>
+        <w:ind w:firstLine="0"/>
+        <w:rPr>
+          <w:rFonts w:ascii="Courier New" w:hAnsi="Courier New" w:cs="Courier New"/>
+          <w:sz w:val="22"/>
+        </w:rPr>
+      </w:pPr>
+      <w:r>
+        <w:rPr>
+          <w:rFonts w:ascii="Courier New" w:hAnsi="Courier New" w:cs="Courier New"/>
+          <w:sz w:val="22"/>
+        </w:rPr>
+        <w:t>    ведут к цели. Убедитесь, что реализуете алгоритм поиска на графе</w:t>
+      </w:r>
+    </w:p>
+    <w:p>
+      <w:pPr>
+        <w:ind w:firstLine="0"/>
+        <w:rPr>
+          <w:rFonts w:ascii="Courier New" w:hAnsi="Courier New" w:cs="Courier New"/>
+          <w:sz w:val="22"/>
+          <w:lang w:val="en-US"/>
+        </w:rPr>
+      </w:pPr>
+      <w:r>
+        <w:rPr>
+          <w:rFonts w:ascii="Courier New" w:hAnsi="Courier New" w:cs="Courier New"/>
+          <w:sz w:val="22"/>
+        </w:rPr>
+        <w:t xml:space="preserve">    </w:t>
+      </w:r>
+      <w:r>
+        <w:rPr>
+          <w:rFonts w:ascii="Courier New" w:hAnsi="Courier New" w:cs="Courier New"/>
+          <w:sz w:val="22"/>
+          <w:lang w:val="en-US"/>
+        </w:rPr>
+        <w:t>"""</w:t>
+      </w:r>
+    </w:p>
+    <w:p>
+      <w:pPr>
+        <w:ind w:firstLine="0"/>
+        <w:rPr>
+          <w:rFonts w:ascii="Courier New" w:hAnsi="Courier New" w:cs="Courier New"/>
+          <w:sz w:val="22"/>
+          <w:lang w:val="en-US"/>
+        </w:rPr>
+      </w:pPr>
+    </w:p>
+    <w:p>
+      <w:pPr>
+        <w:ind w:firstLine="0"/>
+        <w:rPr>
+          <w:rFonts w:ascii="Courier New" w:hAnsi="Courier New" w:cs="Courier New"/>
+          <w:sz w:val="22"/>
+          <w:lang w:val="en-US"/>
+        </w:rPr>
+      </w:pPr>
+      <w:r>
+        <w:rPr>
+          <w:rFonts w:ascii="Courier New" w:hAnsi="Courier New" w:cs="Courier New"/>
+          <w:sz w:val="22"/>
+          <w:lang w:val="en-US"/>
+        </w:rPr>
+        <w:t>    start = problem.getStartState()</w:t>
+      </w:r>
+    </w:p>
+    <w:p>
+      <w:pPr>
+        <w:ind w:firstLine="0"/>
+        <w:rPr>
+          <w:rFonts w:ascii="Courier New" w:hAnsi="Courier New" w:cs="Courier New"/>
+          <w:sz w:val="22"/>
+          <w:lang w:val="en-US"/>
+        </w:rPr>
+      </w:pPr>
+    </w:p>
+    <w:p>
+      <w:pPr>
+        <w:ind w:firstLine="0"/>
+        <w:rPr>
+          <w:rFonts w:ascii="Courier New" w:hAnsi="Courier New" w:cs="Courier New"/>
+          <w:sz w:val="22"/>
+          <w:lang w:val="en-US"/>
+        </w:rPr>
+      </w:pPr>
+      <w:r>
+        <w:rPr>
+          <w:rFonts w:ascii="Courier New" w:hAnsi="Courier New" w:cs="Courier New"/>
+          <w:sz w:val="22"/>
+          <w:lang w:val="en-US"/>
+        </w:rPr>
+        <w:t>    if problem.isGoalState(start): return []</w:t>
+      </w:r>
+    </w:p>
+    <w:p>
+      <w:pPr>
+        <w:ind w:firstLine="0"/>
+        <w:rPr>
+          <w:rFonts w:ascii="Courier New" w:hAnsi="Courier New" w:cs="Courier New"/>
+          <w:sz w:val="22"/>
+          <w:lang w:val="en-US"/>
+        </w:rPr>
+      </w:pPr>
+      <w:r>
+        <w:rPr>
+          <w:rFonts w:ascii="Courier New" w:hAnsi="Courier New" w:cs="Courier New"/>
+          <w:sz w:val="22"/>
+          <w:lang w:val="en-US"/>
+        </w:rPr>
+        <w:t xml:space="preserve">    </w:t>
+      </w:r>
+    </w:p>
+    <w:p>
+      <w:pPr>
+        <w:ind w:firstLine="0"/>
+        <w:rPr>
+          <w:rFonts w:ascii="Courier New" w:hAnsi="Courier New" w:cs="Courier New"/>
+          <w:sz w:val="22"/>
+          <w:lang w:val="en-US"/>
+        </w:rPr>
+      </w:pPr>
+      <w:r>
+        <w:rPr>
+          <w:rFonts w:ascii="Courier New" w:hAnsi="Courier New" w:cs="Courier New"/>
+          <w:sz w:val="22"/>
+          <w:lang w:val="en-US"/>
+        </w:rPr>
+        <w:t>    CLOSED = [start]</w:t>
+      </w:r>
+    </w:p>
+    <w:p>
+      <w:pPr>
+        <w:ind w:firstLine="0"/>
+        <w:rPr>
+          <w:rFonts w:ascii="Courier New" w:hAnsi="Courier New" w:cs="Courier New"/>
+          <w:sz w:val="22"/>
+          <w:lang w:val="en-US"/>
+        </w:rPr>
+      </w:pPr>
+    </w:p>
+    <w:p>
+      <w:pPr>
+        <w:ind w:firstLine="0"/>
+        <w:rPr>
+          <w:rFonts w:ascii="Courier New" w:hAnsi="Courier New" w:cs="Courier New"/>
+          <w:sz w:val="22"/>
+          <w:lang w:val="en-US"/>
+        </w:rPr>
+      </w:pPr>
+      <w:r>
+        <w:rPr>
+          <w:rFonts w:ascii="Courier New" w:hAnsi="Courier New" w:cs="Courier New"/>
+          <w:sz w:val="22"/>
+          <w:lang w:val="en-US"/>
+        </w:rPr>
+        <w:t>    for node in problem.getSuccessors(start):</w:t>
+      </w:r>
+    </w:p>
+    <w:p>
+      <w:pPr>
+        <w:ind w:firstLine="0"/>
+        <w:rPr>
+          <w:rFonts w:ascii="Courier New" w:hAnsi="Courier New" w:cs="Courier New"/>
+          <w:sz w:val="22"/>
+          <w:lang w:val="en-US"/>
+        </w:rPr>
+      </w:pPr>
+      <w:r>
+        <w:rPr>
+          <w:rFonts w:ascii="Courier New" w:hAnsi="Courier New" w:cs="Courier New"/>
+          <w:sz w:val="22"/>
+          <w:lang w:val="en-US"/>
+        </w:rPr>
+        <w:t>        if node[0] in CLOSED: continue</w:t>
+      </w:r>
+    </w:p>
+    <w:p>
+      <w:pPr>
+        <w:ind w:firstLine="0"/>
+        <w:rPr>
+          <w:rFonts w:ascii="Courier New" w:hAnsi="Courier New" w:cs="Courier New"/>
+          <w:sz w:val="22"/>
+          <w:lang w:val="en-US"/>
+        </w:rPr>
+      </w:pPr>
+    </w:p>
+    <w:p>
+      <w:pPr>
+        <w:ind w:firstLine="0"/>
+        <w:rPr>
+          <w:rFonts w:ascii="Courier New" w:hAnsi="Courier New" w:cs="Courier New"/>
+          <w:sz w:val="22"/>
+          <w:lang w:val="en-US"/>
+        </w:rPr>
+      </w:pPr>
+      <w:r>
+        <w:rPr>
+          <w:rFonts w:ascii="Courier New" w:hAnsi="Courier New" w:cs="Courier New"/>
+          <w:sz w:val="22"/>
+          <w:lang w:val="en-US"/>
+        </w:rPr>
+        <w:t>        sub_path = depthSearch(problem, node, CLOSED)</w:t>
+      </w:r>
+    </w:p>
+    <w:p>
+      <w:pPr>
+        <w:ind w:firstLine="0"/>
+        <w:rPr>
+          <w:rFonts w:ascii="Courier New" w:hAnsi="Courier New" w:cs="Courier New"/>
+          <w:sz w:val="22"/>
+          <w:lang w:val="en-US"/>
+        </w:rPr>
+      </w:pPr>
+    </w:p>
+    <w:p>
+      <w:pPr>
+        <w:ind w:firstLine="0"/>
+        <w:rPr>
+          <w:rFonts w:ascii="Courier New" w:hAnsi="Courier New" w:cs="Courier New"/>
+          <w:sz w:val="22"/>
+          <w:lang w:val="en-US"/>
+        </w:rPr>
+      </w:pPr>
+      <w:r>
+        <w:rPr>
+          <w:rFonts w:ascii="Courier New" w:hAnsi="Courier New" w:cs="Courier New"/>
+          <w:sz w:val="22"/>
+          <w:lang w:val="en-US"/>
+        </w:rPr>
+        <w:t>        if sub_path is not None:</w:t>
+      </w:r>
+    </w:p>
+    <w:p>
+      <w:pPr>
+        <w:ind w:firstLine="0"/>
+        <w:rPr>
+          <w:rFonts w:ascii="Courier New" w:hAnsi="Courier New" w:cs="Courier New"/>
+          <w:sz w:val="22"/>
+          <w:lang w:val="en-US"/>
+        </w:rPr>
+      </w:pPr>
+      <w:r>
+        <w:rPr>
+          <w:rFonts w:ascii="Courier New" w:hAnsi="Courier New" w:cs="Courier New"/>
+          <w:sz w:val="22"/>
+          <w:lang w:val="en-US"/>
+        </w:rPr>
+        <w:t>            return [node[1]] + sub_path</w:t>
+      </w:r>
+    </w:p>
+    <w:p>
+      <w:pPr>
+        <w:ind w:firstLine="0"/>
+        <w:rPr>
+          <w:rFonts w:ascii="Courier New" w:hAnsi="Courier New" w:cs="Courier New"/>
+          <w:sz w:val="22"/>
+          <w:lang w:val="en-US"/>
+        </w:rPr>
+      </w:pPr>
+    </w:p>
+    <w:p>
+      <w:pPr>
+        <w:ind w:firstLine="0"/>
+        <w:rPr>
+          <w:rFonts w:ascii="Courier New" w:hAnsi="Courier New" w:cs="Courier New"/>
+          <w:sz w:val="22"/>
+          <w:lang w:val="en-US"/>
+        </w:rPr>
+      </w:pPr>
+      <w:r>
+        <w:rPr>
+          <w:rFonts w:ascii="Courier New" w:hAnsi="Courier New" w:cs="Courier New"/>
+          <w:sz w:val="22"/>
+          <w:lang w:val="en-US"/>
+        </w:rPr>
+        <w:t>    return []</w:t>
+      </w:r>
+    </w:p>
+    <w:p>
+      <w:pPr>
+        <w:ind w:firstLine="0"/>
+        <w:rPr>
+          <w:lang w:val="en-US"/>
+        </w:rPr>
+      </w:pPr>
+    </w:p>
+    <w:p>
+      <w:pPr>
+        <w:ind w:firstLine="0"/>
+        <w:rPr>
+          <w:lang w:val="en-US"/>
+        </w:rPr>
+      </w:pPr>
+      <w:r>
+        <w:t>Листинг</w:t>
+      </w:r>
+      <w:r>
+        <w:rPr>
+          <w:lang w:val="en-US"/>
+        </w:rPr>
+        <w:t xml:space="preserve"> 2 </w:t>
+      </w:r>
+      <w:r>
+        <w:rPr>
+          <w:lang w:val="en-US"/>
+        </w:rPr>
+        <w:t>–</w:t>
+      </w:r>
+      <w:r>
+        <w:rPr>
+          <w:lang w:val="en-US"/>
+        </w:rPr>
+        <w:t xml:space="preserve"> </w:t>
+      </w:r>
+      <w:r>
+        <w:t>Рекурсивная</w:t>
+      </w:r>
+      <w:r>
+        <w:rPr>
+          <w:lang w:val="en-US"/>
+        </w:rPr>
+        <w:t xml:space="preserve"> </w:t>
+      </w:r>
+      <w:r>
+        <w:t>функция</w:t>
+      </w:r>
+    </w:p>
+    <w:p>
+      <w:pPr>
+        <w:ind w:firstLine="0"/>
+        <w:rPr>
+          <w:rFonts w:ascii="Courier New" w:hAnsi="Courier New" w:cs="Courier New"/>
+          <w:sz w:val="22"/>
+          <w:lang w:val="en-US"/>
+        </w:rPr>
+      </w:pPr>
+      <w:r>
+        <w:rPr>
+          <w:rFonts w:ascii="Courier New" w:hAnsi="Courier New" w:cs="Courier New"/>
+          <w:sz w:val="22"/>
+          <w:lang w:val="en-US"/>
+        </w:rPr>
+        <w:t>def depthSearch(problem, node, CLOSED: list) -&gt; list:</w:t>
+      </w:r>
+    </w:p>
+    <w:p>
+      <w:pPr>
+        <w:ind w:firstLine="0"/>
+        <w:rPr>
+          <w:rFonts w:ascii="Courier New" w:hAnsi="Courier New" w:cs="Courier New"/>
+          <w:sz w:val="22"/>
+          <w:lang w:val="en-US"/>
+        </w:rPr>
+      </w:pPr>
+    </w:p>
+    <w:p>
+      <w:pPr>
+        <w:ind w:firstLine="0"/>
+        <w:rPr>
+          <w:rFonts w:ascii="Courier New" w:hAnsi="Courier New" w:cs="Courier New"/>
+          <w:sz w:val="22"/>
+          <w:lang w:val="en-US"/>
+        </w:rPr>
+      </w:pPr>
+      <w:r>
+        <w:rPr>
+          <w:rFonts w:ascii="Courier New" w:hAnsi="Courier New" w:cs="Courier New"/>
+          <w:sz w:val="22"/>
+          <w:lang w:val="en-US"/>
+        </w:rPr>
+        <w:t>    COORDS, WAY, _WEIGHT = node</w:t>
+      </w:r>
+    </w:p>
+    <w:p>
+      <w:pPr>
+        <w:ind w:firstLine="0"/>
+        <w:rPr>
+          <w:rFonts w:ascii="Courier New" w:hAnsi="Courier New" w:cs="Courier New"/>
+          <w:sz w:val="22"/>
+          <w:lang w:val="en-US"/>
+        </w:rPr>
+      </w:pPr>
+    </w:p>
+    <w:p>
+      <w:pPr>
+        <w:ind w:firstLine="0"/>
+        <w:rPr>
+          <w:rFonts w:ascii="Courier New" w:hAnsi="Courier New" w:cs="Courier New"/>
+          <w:sz w:val="22"/>
+          <w:lang w:val="en-US"/>
+        </w:rPr>
+      </w:pPr>
+      <w:r>
+        <w:rPr>
+          <w:rFonts w:ascii="Courier New" w:hAnsi="Courier New" w:cs="Courier New"/>
+          <w:sz w:val="22"/>
+          <w:lang w:val="en-US"/>
+        </w:rPr>
+        <w:t>    if problem.isGoalState(COORDS): return []</w:t>
+      </w:r>
+    </w:p>
+    <w:p>
+      <w:pPr>
+        <w:ind w:firstLine="0"/>
+        <w:rPr>
+          <w:rFonts w:ascii="Courier New" w:hAnsi="Courier New" w:cs="Courier New"/>
+          <w:sz w:val="22"/>
+          <w:lang w:val="en-US"/>
+        </w:rPr>
+      </w:pPr>
+    </w:p>
+    <w:p>
+      <w:pPr>
+        <w:ind w:firstLine="0"/>
+        <w:rPr>
+          <w:rFonts w:ascii="Courier New" w:hAnsi="Courier New" w:cs="Courier New"/>
+          <w:sz w:val="22"/>
+          <w:lang w:val="en-US"/>
+        </w:rPr>
+      </w:pPr>
+      <w:r>
+        <w:rPr>
+          <w:rFonts w:ascii="Courier New" w:hAnsi="Courier New" w:cs="Courier New"/>
+          <w:sz w:val="22"/>
+          <w:lang w:val="en-US"/>
+        </w:rPr>
+        <w:t>    CLOSED.append(COORDS)</w:t>
+      </w:r>
+    </w:p>
+    <w:p>
+      <w:pPr>
+        <w:ind w:firstLine="0"/>
+        <w:rPr>
+          <w:rFonts w:ascii="Courier New" w:hAnsi="Courier New" w:cs="Courier New"/>
+          <w:sz w:val="22"/>
+          <w:lang w:val="en-US"/>
+        </w:rPr>
+      </w:pPr>
+    </w:p>
+    <w:p>
+      <w:pPr>
+        <w:ind w:firstLine="0"/>
+        <w:rPr>
+          <w:rFonts w:ascii="Courier New" w:hAnsi="Courier New" w:cs="Courier New"/>
+          <w:sz w:val="22"/>
+          <w:lang w:val="en-US"/>
+        </w:rPr>
+      </w:pPr>
+      <w:r>
+        <w:rPr>
+          <w:rFonts w:ascii="Courier New" w:hAnsi="Courier New" w:cs="Courier New"/>
+          <w:sz w:val="22"/>
+          <w:lang w:val="en-US"/>
+        </w:rPr>
+        <w:t>    for child in problem.getSuccessors(COORDS):</w:t>
+      </w:r>
+    </w:p>
+    <w:p>
+      <w:pPr>
+        <w:ind w:firstLine="0"/>
+        <w:rPr>
+          <w:rFonts w:ascii="Courier New" w:hAnsi="Courier New" w:cs="Courier New"/>
+          <w:sz w:val="22"/>
+          <w:lang w:val="en-US"/>
+        </w:rPr>
+      </w:pPr>
+      <w:r>
+        <w:rPr>
+          <w:rFonts w:ascii="Courier New" w:hAnsi="Courier New" w:cs="Courier New"/>
+          <w:sz w:val="22"/>
+          <w:lang w:val="en-US"/>
+        </w:rPr>
+        <w:t>        if child[0] in CLOSED: continue</w:t>
+      </w:r>
+    </w:p>
+    <w:p>
+      <w:pPr>
+        <w:ind w:firstLine="0"/>
+        <w:rPr>
+          <w:rFonts w:ascii="Courier New" w:hAnsi="Courier New" w:cs="Courier New"/>
+          <w:sz w:val="22"/>
+          <w:lang w:val="en-US"/>
+        </w:rPr>
+      </w:pPr>
+    </w:p>
+    <w:p>
+      <w:pPr>
+        <w:ind w:firstLine="0"/>
+        <w:rPr>
+          <w:rFonts w:ascii="Courier New" w:hAnsi="Courier New" w:cs="Courier New"/>
+          <w:sz w:val="22"/>
+          <w:lang w:val="en-US"/>
+        </w:rPr>
+      </w:pPr>
+      <w:r>
+        <w:rPr>
+          <w:rFonts w:ascii="Courier New" w:hAnsi="Courier New" w:cs="Courier New"/>
+          <w:sz w:val="22"/>
+          <w:lang w:val="en-US"/>
+        </w:rPr>
+        <w:t>        sub_path = depthSearch(problem, child, CLOSED)</w:t>
+      </w:r>
+    </w:p>
+    <w:p>
+      <w:pPr>
+        <w:ind w:firstLine="0"/>
+        <w:rPr>
+          <w:rFonts w:ascii="Courier New" w:hAnsi="Courier New" w:cs="Courier New"/>
+          <w:sz w:val="22"/>
+          <w:lang w:val="en-US"/>
+        </w:rPr>
+      </w:pPr>
+    </w:p>
+    <w:p>
+      <w:pPr>
+        <w:ind w:firstLine="0"/>
+        <w:rPr>
+          <w:rFonts w:ascii="Courier New" w:hAnsi="Courier New" w:cs="Courier New"/>
+          <w:sz w:val="22"/>
+          <w:lang w:val="en-US"/>
+        </w:rPr>
+      </w:pPr>
+      <w:r>
+        <w:rPr>
+          <w:rFonts w:ascii="Courier New" w:hAnsi="Courier New" w:cs="Courier New"/>
+          <w:sz w:val="22"/>
+          <w:lang w:val="en-US"/>
+        </w:rPr>
+        <w:t>        if sub_path is not None:</w:t>
+      </w:r>
+    </w:p>
+    <w:p>
+      <w:pPr>
+        <w:ind w:firstLine="0"/>
+        <w:rPr>
+          <w:rFonts w:ascii="Courier New" w:hAnsi="Courier New" w:cs="Courier New"/>
+          <w:sz w:val="22"/>
+          <w:lang w:val="en-US"/>
+        </w:rPr>
+      </w:pPr>
+      <w:r>
+        <w:rPr>
+          <w:rFonts w:ascii="Courier New" w:hAnsi="Courier New" w:cs="Courier New"/>
+          <w:sz w:val="22"/>
+          <w:lang w:val="en-US"/>
+        </w:rPr>
+        <w:t>            return [child[1]] + sub_path</w:t>
+      </w:r>
+    </w:p>
+    <w:p>
+      <w:pPr>
+        <w:ind w:firstLine="0"/>
+        <w:rPr>
+          <w:rFonts w:ascii="Courier New" w:hAnsi="Courier New" w:cs="Courier New"/>
+          <w:sz w:val="22"/>
+          <w:lang w:val="en-US"/>
+        </w:rPr>
+      </w:pPr>
+    </w:p>
+    <w:p>
+      <w:pPr>
+        <w:ind w:firstLine="0"/>
+        <w:rPr>
+          <w:rFonts w:ascii="Courier New" w:hAnsi="Courier New" w:cs="Courier New"/>
+          <w:sz w:val="22"/>
+          <w:lang w:val="en-US"/>
+        </w:rPr>
+      </w:pPr>
+      <w:r>
+        <w:rPr>
+          <w:rFonts w:ascii="Courier New" w:hAnsi="Courier New" w:cs="Courier New"/>
+          <w:sz w:val="22"/>
+          <w:lang w:val="en-US"/>
+        </w:rPr>
+        <w:t>    return None</w:t>
+      </w:r>
+    </w:p>
+    <w:p>
+      <w:pPr>
+        <w:ind w:firstLine="0"/>
+      </w:pPr>
+    </w:p>
+    <w:p>
+      <w:pPr>
+        <w:ind w:firstLine="0"/>
+        <w:jc w:val="center"/>
+      </w:pPr>
+      <w:r>
+        <w:drawing>
+          <wp:inline distT="0" distB="0" distL="0" distR="0" wp14:anchorId="2AE2F2B7" wp14:editId="636EB878">
+            <wp:extent cx="4705350" cy="1091460"/>
+            <wp:effectExtent l="0" t="0" r="0" b="0"/>
+            <wp:docPr id="816994202" name="Рисунок 1"/>
+            <wp:cNvGraphicFramePr>
+              <a:graphicFrameLocks xmlns:a="http://schemas.openxmlformats.org/drawingml/2006/main" noChangeAspect="1"/>
+            </wp:cNvGraphicFramePr>
+            <a:graphic xmlns:a="http://schemas.openxmlformats.org/drawingml/2006/main">
+              <a:graphicData uri="http://schemas.openxmlformats.org/drawingml/2006/picture">
+                <pic:pic xmlns:pic="http://schemas.openxmlformats.org/drawingml/2006/picture">
+                  <pic:nvPicPr>
+                    <pic:cNvPr id="816994202" name=""/>
+                    <pic:cNvPicPr/>
+                  </pic:nvPicPr>
+                  <pic:blipFill>
+                    <a:blip r:embed="rId5"/>
+                    <a:stretch>
+                      <a:fillRect/>
+                    </a:stretch>
+                  </pic:blipFill>
+                  <pic:spPr>
+                    <a:xfrm>
+                      <a:off x="0" y="0"/>
+                      <a:ext cx="4720666" cy="1095013"/>
+                    </a:xfrm>
+                    <a:prstGeom prst="rect">
+                      <a:avLst/>
+                    </a:prstGeom>
+                  </pic:spPr>
+                </pic:pic>
+              </a:graphicData>
+            </a:graphic>
+          </wp:inline>
+        </w:drawing>
+      </w:r>
+    </w:p>
+    <w:p>
+      <w:pPr>
+        <w:ind w:firstLine="0"/>
+        <w:jc w:val="center"/>
+      </w:pPr>
+      <w:r>
+        <w:t>Рисунок 1 – Прохождение алгоритмом поиска в глубину маленького лабиринта</w:t>
+      </w:r>
+    </w:p>
+    <w:p>
+      <w:pPr>
+        <w:ind w:firstLine="0"/>
+        <w:jc w:val="center"/>
+      </w:pPr>
+    </w:p>
+    <w:p>
+      <w:pPr>
+        <w:ind w:firstLine="0"/>
+        <w:jc w:val="center"/>
+      </w:pPr>
+      <w:r>
+        <w:drawing>
+          <wp:inline distT="0" distB="0" distL="0" distR="0" wp14:anchorId="687919A6" wp14:editId="137CDE03">
+            <wp:extent cx="4714875" cy="1072502"/>
+            <wp:effectExtent l="0" t="0" r="0" b="0"/>
+            <wp:docPr id="415066389" name="Рисунок 1"/>
+            <wp:cNvGraphicFramePr>
+              <a:graphicFrameLocks xmlns:a="http://schemas.openxmlformats.org/drawingml/2006/main" noChangeAspect="1"/>
+            </wp:cNvGraphicFramePr>
+            <a:graphic xmlns:a="http://schemas.openxmlformats.org/drawingml/2006/main">
+              <a:graphicData uri="http://schemas.openxmlformats.org/drawingml/2006/picture">
+                <pic:pic xmlns:pic="http://schemas.openxmlformats.org/drawingml/2006/picture">
+                  <pic:nvPicPr>
+                    <pic:cNvPr id="415066389" name=""/>
+                    <pic:cNvPicPr/>
+                  </pic:nvPicPr>
+                  <pic:blipFill>
+                    <a:blip r:embed="rId6"/>
+                    <a:stretch>
+                      <a:fillRect/>
+                    </a:stretch>
+                  </pic:blipFill>
+                  <pic:spPr>
+                    <a:xfrm>
+                      <a:off x="0" y="0"/>
+                      <a:ext cx="4733618" cy="1076765"/>
+                    </a:xfrm>
+                    <a:prstGeom prst="rect">
+                      <a:avLst/>
+                    </a:prstGeom>
+                  </pic:spPr>
+                </pic:pic>
+              </a:graphicData>
+            </a:graphic>
+          </wp:inline>
+        </w:drawing>
+      </w:r>
+    </w:p>
+    <w:p>
+      <w:pPr>
+        <w:ind w:firstLine="0"/>
+        <w:jc w:val="center"/>
+      </w:pPr>
+      <w:r>
+        <w:t xml:space="preserve">Рисунок </w:t>
+      </w:r>
+      <w:r>
+        <w:t>2</w:t>
+      </w:r>
+      <w:r>
+        <w:t xml:space="preserve"> – Прохождение алгоритм</w:t>
+      </w:r>
+      <w:r>
+        <w:t>ом</w:t>
+      </w:r>
+      <w:r>
+        <w:t xml:space="preserve"> поиска в глубину </w:t>
+      </w:r>
+      <w:r>
+        <w:t>среднего</w:t>
+      </w:r>
+      <w:r>
+        <w:t xml:space="preserve"> лабиринта</w:t>
+      </w:r>
+    </w:p>
+    <w:p>
+      <w:pPr>
+        <w:ind w:firstLine="0"/>
+        <w:jc w:val="center"/>
+      </w:pPr>
+    </w:p>
+    <w:p>
+      <w:pPr>
+        <w:ind w:firstLine="0"/>
+        <w:jc w:val="center"/>
+      </w:pPr>
+      <w:r>
+        <w:drawing>
+          <wp:inline distT="0" distB="0" distL="0" distR="0" wp14:anchorId="3777015E" wp14:editId="72775431">
+            <wp:extent cx="5172075" cy="1125638"/>
+            <wp:effectExtent l="0" t="0" r="0" b="0"/>
+            <wp:docPr id="1192725333" name="Рисунок 1"/>
+            <wp:cNvGraphicFramePr>
+              <a:graphicFrameLocks xmlns:a="http://schemas.openxmlformats.org/drawingml/2006/main" noChangeAspect="1"/>
+            </wp:cNvGraphicFramePr>
+            <a:graphic xmlns:a="http://schemas.openxmlformats.org/drawingml/2006/main">
+              <a:graphicData uri="http://schemas.openxmlformats.org/drawingml/2006/picture">
+                <pic:pic xmlns:pic="http://schemas.openxmlformats.org/drawingml/2006/picture">
+                  <pic:nvPicPr>
+                    <pic:cNvPr id="1192725333" name=""/>
+                    <pic:cNvPicPr/>
+                  </pic:nvPicPr>
+                  <pic:blipFill>
+                    <a:blip r:embed="rId7"/>
+                    <a:stretch>
+                      <a:fillRect/>
+                    </a:stretch>
+                  </pic:blipFill>
+                  <pic:spPr>
+                    <a:xfrm>
+                      <a:off x="0" y="0"/>
+                      <a:ext cx="5199888" cy="1131691"/>
+                    </a:xfrm>
+                    <a:prstGeom prst="rect">
+                      <a:avLst/>
+                    </a:prstGeom>
+                  </pic:spPr>
+                </pic:pic>
+              </a:graphicData>
+            </a:graphic>
+          </wp:inline>
+        </w:drawing>
+      </w:r>
+      <w:r>
+        <w:t xml:space="preserve"> </w:t>
+      </w:r>
+    </w:p>
+    <w:p>
+      <w:pPr>
+        <w:ind w:firstLine="0"/>
+        <w:jc w:val="center"/>
+      </w:pPr>
+      <w:r>
+        <w:t xml:space="preserve">Рисунок </w:t>
+      </w:r>
+      <w:r>
+        <w:t>3</w:t>
+      </w:r>
+      <w:r>
+        <w:t xml:space="preserve"> – Прохождение алгоритм</w:t>
+      </w:r>
+      <w:r>
+        <w:t>ом</w:t>
+      </w:r>
+      <w:r>
+        <w:t xml:space="preserve"> поиска в глубину </w:t>
+      </w:r>
+      <w:r>
+        <w:t>большого</w:t>
+      </w:r>
+      <w:r>
+        <w:t xml:space="preserve"> лабиринта</w:t>
+      </w:r>
+    </w:p>
+    <w:p>
+      <w:pPr>
+        <w:ind w:firstLine="0"/>
+        <w:jc w:val="center"/>
+      </w:pPr>
+    </w:p>
+    <w:p>
+      <w:pPr>
+        <w:ind w:firstLine="0"/>
+        <w:jc w:val="center"/>
+      </w:pPr>
+      <w:r>
+        <w:drawing>
+          <wp:inline distT="0" distB="0" distL="0" distR="0" wp14:anchorId="2D592359" wp14:editId="32957729">
+            <wp:extent cx="5162550" cy="2271963"/>
+            <wp:effectExtent l="0" t="0" r="0" b="0"/>
+            <wp:docPr id="2028290728" name="Рисунок 1"/>
+            <wp:cNvGraphicFramePr>
+              <a:graphicFrameLocks xmlns:a="http://schemas.openxmlformats.org/drawingml/2006/main" noChangeAspect="1"/>
+            </wp:cNvGraphicFramePr>
+            <a:graphic xmlns:a="http://schemas.openxmlformats.org/drawingml/2006/main">
+              <a:graphicData uri="http://schemas.openxmlformats.org/drawingml/2006/picture">
+                <pic:pic xmlns:pic="http://schemas.openxmlformats.org/drawingml/2006/picture">
+                  <pic:nvPicPr>
+                    <pic:cNvPr id="2028290728" name=""/>
+                    <pic:cNvPicPr/>
+                  </pic:nvPicPr>
+                  <pic:blipFill>
+                    <a:blip r:embed="rId8"/>
+                    <a:stretch>
+                      <a:fillRect/>
+                    </a:stretch>
+                  </pic:blipFill>
+                  <pic:spPr>
+                    <a:xfrm>
+                      <a:off x="0" y="0"/>
+                      <a:ext cx="5162550" cy="2271963"/>
+                    </a:xfrm>
+                    <a:prstGeom prst="rect">
+                      <a:avLst/>
+                    </a:prstGeom>
+                  </pic:spPr>
+                </pic:pic>
+              </a:graphicData>
+            </a:graphic>
+          </wp:inline>
+        </w:drawing>
+      </w:r>
+    </w:p>
+    <w:p>
+      <w:pPr>
+        <w:ind w:firstLine="0"/>
+        <w:jc w:val="center"/>
+      </w:pPr>
+      <w:r>
+        <w:t>Рисунок 4 – Прохождение авто оценщика для алгоритма поиска в глубину</w:t>
+      </w:r>
+    </w:p>
+    <w:p>
+      <w:pPr>
+        <w:ind w:firstLine="0"/>
+      </w:pPr>
+    </w:p>
+    <w:p>
+      <w:r>
+        <w:t xml:space="preserve">2. Реализация поиска в ширину. В методе был изложен примерный алгоритм, приводящий к решению поставленной задачи. В соответствии с этим алгоритмом и был сформирован код (Листинг 3) и поиск обратного пути функцией </w:t>
+      </w:r>
+      <w:r>
+        <w:rPr>
+          <w:lang w:val="en-US"/>
+        </w:rPr>
+        <w:t>Path</w:t>
+      </w:r>
+      <w:r>
+        <w:t xml:space="preserve"> (</w:t>
+      </w:r>
+      <w:r>
+        <w:t>Листинг 4</w:t>
+      </w:r>
+      <w:r>
+        <w:t>)</w:t>
+      </w:r>
+      <w:r>
+        <w:t>.</w:t>
+      </w:r>
+      <w:r>
+        <w:t xml:space="preserve"> </w:t>
+      </w:r>
+      <w:r>
+        <w:t xml:space="preserve">Тесты пройдены (Рисунок </w:t>
+      </w:r>
+      <w:r>
+        <w:t>5</w:t>
+      </w:r>
+      <w:r>
+        <w:t xml:space="preserve"> – </w:t>
+      </w:r>
+      <w:r>
+        <w:t>7</w:t>
+      </w:r>
+      <w:r>
+        <w:t>).</w:t>
+      </w:r>
+    </w:p>
+    <w:p>
+      <w:pPr>
+        <w:ind w:firstLine="0"/>
+      </w:pPr>
+    </w:p>
+    <w:p>
+      <w:pPr>
+        <w:ind w:firstLine="0"/>
+      </w:pPr>
+      <w:r>
+        <w:t xml:space="preserve">Листинг 3 </w:t>
+      </w:r>
+      <w:r>
+        <w:t>–</w:t>
+      </w:r>
+      <w:r>
+        <w:t xml:space="preserve"> Функция</w:t>
+      </w:r>
+      <w:r>
+        <w:t xml:space="preserve"> поиска в ширину</w:t>
+      </w:r>
+    </w:p>
+    <w:p>
+      <w:pPr>
+        <w:ind w:firstLine="0"/>
+        <w:rPr>
+          <w:rFonts w:ascii="Courier New" w:hAnsi="Courier New" w:cs="Courier New"/>
+          <w:sz w:val="22"/>
+        </w:rPr>
+      </w:pPr>
+      <w:r>
+        <w:rPr>
+          <w:rFonts w:ascii="Courier New" w:hAnsi="Courier New" w:cs="Courier New"/>
+          <w:sz w:val="22"/>
+          <w:lang w:val="en-US"/>
+        </w:rPr>
+        <w:t>from</w:t>
+      </w:r>
+      <w:r>
+        <w:rPr>
+          <w:rFonts w:ascii="Courier New" w:hAnsi="Courier New" w:cs="Courier New"/>
+          <w:sz w:val="22"/>
+        </w:rPr>
+        <w:t xml:space="preserve"> </w:t>
+      </w:r>
+      <w:r>
+        <w:rPr>
+          <w:rFonts w:ascii="Courier New" w:hAnsi="Courier New" w:cs="Courier New"/>
+          <w:sz w:val="22"/>
+          <w:lang w:val="en-US"/>
+        </w:rPr>
+        <w:t>util</w:t>
+      </w:r>
+      <w:r>
+        <w:rPr>
+          <w:rFonts w:ascii="Courier New" w:hAnsi="Courier New" w:cs="Courier New"/>
+          <w:sz w:val="22"/>
+        </w:rPr>
+        <w:t xml:space="preserve"> </w:t>
+      </w:r>
+      <w:r>
+        <w:rPr>
+          <w:rFonts w:ascii="Courier New" w:hAnsi="Courier New" w:cs="Courier New"/>
+          <w:sz w:val="22"/>
+          <w:lang w:val="en-US"/>
+        </w:rPr>
+        <w:t>import</w:t>
+      </w:r>
+      <w:r>
+        <w:rPr>
+          <w:rFonts w:ascii="Courier New" w:hAnsi="Courier New" w:cs="Courier New"/>
+          <w:sz w:val="22"/>
+        </w:rPr>
+        <w:t xml:space="preserve"> </w:t>
+      </w:r>
+      <w:r>
+        <w:rPr>
+          <w:rFonts w:ascii="Courier New" w:hAnsi="Courier New" w:cs="Courier New"/>
+          <w:sz w:val="22"/>
+          <w:lang w:val="en-US"/>
+        </w:rPr>
+        <w:t>Queue</w:t>
+      </w:r>
+    </w:p>
+    <w:p>
+      <w:pPr>
+        <w:ind w:firstLine="0"/>
+        <w:rPr>
+          <w:rFonts w:ascii="Courier New" w:hAnsi="Courier New" w:cs="Courier New"/>
+          <w:sz w:val="22"/>
+          <w:lang w:val="en-US"/>
+        </w:rPr>
+      </w:pPr>
+      <w:r>
+        <w:rPr>
+          <w:rFonts w:ascii="Courier New" w:hAnsi="Courier New" w:cs="Courier New"/>
+          <w:sz w:val="22"/>
+          <w:lang w:val="en-US"/>
+        </w:rPr>
+        <w:t>def breadthFirstSearch(problem):</w:t>
+      </w:r>
+    </w:p>
+    <w:p>
+      <w:pPr>
+        <w:ind w:firstLine="0"/>
+        <w:rPr>
+          <w:rFonts w:ascii="Courier New" w:hAnsi="Courier New" w:cs="Courier New"/>
+          <w:sz w:val="22"/>
+          <w:lang w:val="en-US"/>
+        </w:rPr>
+      </w:pPr>
+      <w:r>
+        <w:rPr>
+          <w:rFonts w:ascii="Courier New" w:hAnsi="Courier New" w:cs="Courier New"/>
+          <w:sz w:val="22"/>
+          <w:lang w:val="en-US"/>
+        </w:rPr>
+        <w:t>    start = problem.getStartState()</w:t>
+      </w:r>
+    </w:p>
+    <w:p>
+      <w:pPr>
+        <w:ind w:firstLine="0"/>
+        <w:rPr>
+          <w:rFonts w:ascii="Courier New" w:hAnsi="Courier New" w:cs="Courier New"/>
+          <w:sz w:val="22"/>
+          <w:lang w:val="en-US"/>
+        </w:rPr>
+      </w:pPr>
+      <w:r>
+        <w:rPr>
+          <w:rFonts w:ascii="Courier New" w:hAnsi="Courier New" w:cs="Courier New"/>
+          <w:sz w:val="22"/>
+          <w:lang w:val="en-US"/>
+        </w:rPr>
+        <w:t>    if problem.isGoalState(start):</w:t>
+      </w:r>
+    </w:p>
+    <w:p>
+      <w:pPr>
+        <w:ind w:firstLine="0"/>
+        <w:rPr>
+          <w:rFonts w:ascii="Courier New" w:hAnsi="Courier New" w:cs="Courier New"/>
+          <w:sz w:val="22"/>
+          <w:lang w:val="en-US"/>
+        </w:rPr>
+      </w:pPr>
+      <w:r>
+        <w:rPr>
+          <w:rFonts w:ascii="Courier New" w:hAnsi="Courier New" w:cs="Courier New"/>
+          <w:sz w:val="22"/>
+          <w:lang w:val="en-US"/>
+        </w:rPr>
+        <w:t>        return []</w:t>
+      </w:r>
+    </w:p>
+    <w:p>
+      <w:pPr>
+        <w:ind w:firstLine="0"/>
+        <w:rPr>
+          <w:rFonts w:ascii="Courier New" w:hAnsi="Courier New" w:cs="Courier New"/>
+          <w:sz w:val="22"/>
+          <w:lang w:val="en-US"/>
+        </w:rPr>
+      </w:pPr>
+    </w:p>
+    <w:p>
+      <w:pPr>
+        <w:ind w:firstLine="0"/>
+        <w:rPr>
+          <w:rFonts w:ascii="Courier New" w:hAnsi="Courier New" w:cs="Courier New"/>
+          <w:sz w:val="22"/>
+          <w:lang w:val="en-US"/>
+        </w:rPr>
+      </w:pPr>
+      <w:r>
+        <w:rPr>
+          <w:rFonts w:ascii="Courier New" w:hAnsi="Courier New" w:cs="Courier New"/>
+          <w:sz w:val="22"/>
+          <w:lang w:val="en-US"/>
+        </w:rPr>
+        <w:t>    OPEN = Queue()</w:t>
+      </w:r>
+    </w:p>
+    <w:p>
+      <w:pPr>
+        <w:ind w:firstLine="0"/>
+        <w:rPr>
+          <w:rFonts w:ascii="Courier New" w:hAnsi="Courier New" w:cs="Courier New"/>
+          <w:sz w:val="22"/>
+          <w:lang w:val="en-US"/>
+        </w:rPr>
+      </w:pPr>
+      <w:r>
+        <w:rPr>
+          <w:rFonts w:ascii="Courier New" w:hAnsi="Courier New" w:cs="Courier New"/>
+          <w:sz w:val="22"/>
+          <w:lang w:val="en-US"/>
+        </w:rPr>
+        <w:t>    CLOSED = {start}</w:t>
+      </w:r>
+    </w:p>
+    <w:p>
+      <w:pPr>
+        <w:ind w:firstLine="0"/>
+        <w:rPr>
+          <w:rFonts w:ascii="Courier New" w:hAnsi="Courier New" w:cs="Courier New"/>
+          <w:sz w:val="22"/>
+          <w:lang w:val="en-US"/>
+        </w:rPr>
+      </w:pPr>
+      <w:r>
+        <w:rPr>
+          <w:rFonts w:ascii="Courier New" w:hAnsi="Courier New" w:cs="Courier New"/>
+          <w:sz w:val="22"/>
+          <w:lang w:val="en-US"/>
+        </w:rPr>
+        <w:t>    parent = {}</w:t>
+      </w:r>
+    </w:p>
+    <w:p>
+      <w:pPr>
+        <w:ind w:firstLine="0"/>
+        <w:rPr>
+          <w:rFonts w:ascii="Courier New" w:hAnsi="Courier New" w:cs="Courier New"/>
+          <w:sz w:val="22"/>
+          <w:lang w:val="en-US"/>
+        </w:rPr>
+      </w:pPr>
+    </w:p>
+    <w:p>
+      <w:pPr>
+        <w:ind w:firstLine="0"/>
+        <w:rPr>
+          <w:rFonts w:ascii="Courier New" w:hAnsi="Courier New" w:cs="Courier New"/>
+          <w:sz w:val="22"/>
+          <w:lang w:val="en-US"/>
+        </w:rPr>
+      </w:pPr>
+      <w:r>
+        <w:rPr>
+          <w:rFonts w:ascii="Courier New" w:hAnsi="Courier New" w:cs="Courier New"/>
+          <w:sz w:val="22"/>
+          <w:lang w:val="en-US"/>
+        </w:rPr>
+        <w:t>    for child, action, _ in problem.getSuccessors(start):</w:t>
+      </w:r>
+    </w:p>
+    <w:p>
+      <w:pPr>
+        <w:ind w:firstLine="0"/>
+        <w:rPr>
+          <w:rFonts w:ascii="Courier New" w:hAnsi="Courier New" w:cs="Courier New"/>
+          <w:sz w:val="22"/>
+          <w:lang w:val="en-US"/>
+        </w:rPr>
+      </w:pPr>
+      <w:r>
+        <w:rPr>
+          <w:rFonts w:ascii="Courier New" w:hAnsi="Courier New" w:cs="Courier New"/>
+          <w:sz w:val="22"/>
+          <w:lang w:val="en-US"/>
+        </w:rPr>
+        <w:t>        if child in CLOSED: continue</w:t>
+      </w:r>
+    </w:p>
+    <w:p>
+      <w:pPr>
+        <w:ind w:firstLine="0"/>
+        <w:rPr>
+          <w:rFonts w:ascii="Courier New" w:hAnsi="Courier New" w:cs="Courier New"/>
+          <w:sz w:val="22"/>
+          <w:lang w:val="en-US"/>
+        </w:rPr>
+      </w:pPr>
+      <w:r>
+        <w:rPr>
+          <w:rFonts w:ascii="Courier New" w:hAnsi="Courier New" w:cs="Courier New"/>
+          <w:sz w:val="22"/>
+          <w:lang w:val="en-US"/>
+        </w:rPr>
+        <w:t xml:space="preserve">        </w:t>
+      </w:r>
+    </w:p>
+    <w:p>
+      <w:pPr>
+        <w:ind w:firstLine="0"/>
+        <w:rPr>
+          <w:rFonts w:ascii="Courier New" w:hAnsi="Courier New" w:cs="Courier New"/>
+          <w:sz w:val="22"/>
+          <w:lang w:val="en-US"/>
+        </w:rPr>
+      </w:pPr>
+      <w:r>
+        <w:rPr>
+          <w:rFonts w:ascii="Courier New" w:hAnsi="Courier New" w:cs="Courier New"/>
+          <w:sz w:val="22"/>
+          <w:lang w:val="en-US"/>
+        </w:rPr>
+        <w:t>        CLOSED.add(child)</w:t>
+      </w:r>
+    </w:p>
+    <w:p>
+      <w:pPr>
+        <w:ind w:firstLine="0"/>
+        <w:rPr>
+          <w:rFonts w:ascii="Courier New" w:hAnsi="Courier New" w:cs="Courier New"/>
+          <w:sz w:val="22"/>
+          <w:lang w:val="en-US"/>
+        </w:rPr>
+      </w:pPr>
+      <w:r>
+        <w:rPr>
+          <w:rFonts w:ascii="Courier New" w:hAnsi="Courier New" w:cs="Courier New"/>
+          <w:sz w:val="22"/>
+          <w:lang w:val="en-US"/>
+        </w:rPr>
+        <w:t>        parent[child] = (start, action)</w:t>
+      </w:r>
+    </w:p>
+    <w:p>
+      <w:pPr>
+        <w:ind w:firstLine="0"/>
+        <w:rPr>
+          <w:rFonts w:ascii="Courier New" w:hAnsi="Courier New" w:cs="Courier New"/>
+          <w:sz w:val="22"/>
+          <w:lang w:val="en-US"/>
+        </w:rPr>
+      </w:pPr>
+      <w:r>
+        <w:rPr>
+          <w:rFonts w:ascii="Courier New" w:hAnsi="Courier New" w:cs="Courier New"/>
+          <w:sz w:val="22"/>
+          <w:lang w:val="en-US"/>
+        </w:rPr>
+        <w:t xml:space="preserve">        </w:t>
+      </w:r>
+    </w:p>
+    <w:p>
+      <w:pPr>
+        <w:ind w:firstLine="0"/>
+        <w:rPr>
+          <w:rFonts w:ascii="Courier New" w:hAnsi="Courier New" w:cs="Courier New"/>
+          <w:sz w:val="22"/>
+          <w:lang w:val="en-US"/>
+        </w:rPr>
+      </w:pPr>
+      <w:r>
+        <w:rPr>
+          <w:rFonts w:ascii="Courier New" w:hAnsi="Courier New" w:cs="Courier New"/>
+          <w:sz w:val="22"/>
+          <w:lang w:val="en-US"/>
+        </w:rPr>
+        <w:t>        OPEN.push((child, action))</w:t>
+      </w:r>
+    </w:p>
+    <w:p>
+      <w:pPr>
+        <w:ind w:firstLine="0"/>
+        <w:rPr>
+          <w:rFonts w:ascii="Courier New" w:hAnsi="Courier New" w:cs="Courier New"/>
+          <w:sz w:val="22"/>
+          <w:lang w:val="en-US"/>
+        </w:rPr>
+      </w:pPr>
+    </w:p>
+    <w:p>
+      <w:pPr>
+        <w:ind w:firstLine="0"/>
+        <w:rPr>
+          <w:rFonts w:ascii="Courier New" w:hAnsi="Courier New" w:cs="Courier New"/>
+          <w:sz w:val="22"/>
+          <w:lang w:val="en-US"/>
+        </w:rPr>
+      </w:pPr>
+      <w:r>
+        <w:rPr>
+          <w:rFonts w:ascii="Courier New" w:hAnsi="Courier New" w:cs="Courier New"/>
+          <w:sz w:val="22"/>
+          <w:lang w:val="en-US"/>
+        </w:rPr>
+        <w:t>    while not OPEN.isEmpty():</w:t>
+      </w:r>
+    </w:p>
+    <w:p>
+      <w:pPr>
+        <w:ind w:firstLine="0"/>
+        <w:rPr>
+          <w:rFonts w:ascii="Courier New" w:hAnsi="Courier New" w:cs="Courier New"/>
+          <w:sz w:val="22"/>
+          <w:lang w:val="en-US"/>
+        </w:rPr>
+      </w:pPr>
+      <w:r>
+        <w:rPr>
+          <w:rFonts w:ascii="Courier New" w:hAnsi="Courier New" w:cs="Courier New"/>
+          <w:sz w:val="22"/>
+          <w:lang w:val="en-US"/>
+        </w:rPr>
+        <w:t>        node, action = OPEN.pop()</w:t>
+      </w:r>
+    </w:p>
+    <w:p>
+      <w:pPr>
+        <w:ind w:firstLine="0"/>
+        <w:rPr>
+          <w:rFonts w:ascii="Courier New" w:hAnsi="Courier New" w:cs="Courier New"/>
+          <w:sz w:val="22"/>
+          <w:lang w:val="en-US"/>
+        </w:rPr>
+      </w:pPr>
+    </w:p>
+    <w:p>
+      <w:pPr>
+        <w:ind w:firstLine="0"/>
+        <w:rPr>
+          <w:rFonts w:ascii="Courier New" w:hAnsi="Courier New" w:cs="Courier New"/>
+          <w:sz w:val="22"/>
+          <w:lang w:val="en-US"/>
+        </w:rPr>
+      </w:pPr>
+      <w:r>
+        <w:rPr>
+          <w:rFonts w:ascii="Courier New" w:hAnsi="Courier New" w:cs="Courier New"/>
+          <w:sz w:val="22"/>
+          <w:lang w:val="en-US"/>
+        </w:rPr>
+        <w:t>        if problem.isGoalState(node): return Path(problem, node, parent)</w:t>
+      </w:r>
+    </w:p>
+    <w:p>
+      <w:pPr>
+        <w:ind w:firstLine="0"/>
+        <w:rPr>
+          <w:rFonts w:ascii="Courier New" w:hAnsi="Courier New" w:cs="Courier New"/>
+          <w:sz w:val="22"/>
+          <w:lang w:val="en-US"/>
+        </w:rPr>
+      </w:pPr>
+    </w:p>
+    <w:p>
+      <w:pPr>
+        <w:ind w:firstLine="0"/>
+        <w:rPr>
+          <w:rFonts w:ascii="Courier New" w:hAnsi="Courier New" w:cs="Courier New"/>
+          <w:sz w:val="22"/>
+          <w:lang w:val="en-US"/>
+        </w:rPr>
+      </w:pPr>
+      <w:r>
+        <w:rPr>
+          <w:rFonts w:ascii="Courier New" w:hAnsi="Courier New" w:cs="Courier New"/>
+          <w:sz w:val="22"/>
+          <w:lang w:val="en-US"/>
+        </w:rPr>
+        <w:t>        for child, child_action, _ in problem.getSuccessors(node):</w:t>
+      </w:r>
+    </w:p>
+    <w:p>
+      <w:pPr>
+        <w:ind w:firstLine="0"/>
+        <w:rPr>
+          <w:rFonts w:ascii="Courier New" w:hAnsi="Courier New" w:cs="Courier New"/>
+          <w:sz w:val="22"/>
+          <w:lang w:val="en-US"/>
+        </w:rPr>
+      </w:pPr>
+      <w:r>
+        <w:rPr>
+          <w:rFonts w:ascii="Courier New" w:hAnsi="Courier New" w:cs="Courier New"/>
+          <w:sz w:val="22"/>
+          <w:lang w:val="en-US"/>
+        </w:rPr>
+        <w:t>            if child in CLOSED: continue</w:t>
+      </w:r>
+    </w:p>
+    <w:p>
+      <w:pPr>
+        <w:ind w:firstLine="0"/>
+        <w:rPr>
+          <w:rFonts w:ascii="Courier New" w:hAnsi="Courier New" w:cs="Courier New"/>
+          <w:sz w:val="22"/>
+          <w:lang w:val="en-US"/>
+        </w:rPr>
+      </w:pPr>
+      <w:r>
+        <w:rPr>
+          <w:rFonts w:ascii="Courier New" w:hAnsi="Courier New" w:cs="Courier New"/>
+          <w:sz w:val="22"/>
+          <w:lang w:val="en-US"/>
+        </w:rPr>
+        <w:t xml:space="preserve">            </w:t>
+      </w:r>
+    </w:p>
+    <w:p>
+      <w:pPr>
+        <w:ind w:firstLine="0"/>
+        <w:rPr>
+          <w:rFonts w:ascii="Courier New" w:hAnsi="Courier New" w:cs="Courier New"/>
+          <w:sz w:val="22"/>
+          <w:lang w:val="en-US"/>
+        </w:rPr>
+      </w:pPr>
+      <w:r>
+        <w:rPr>
+          <w:rFonts w:ascii="Courier New" w:hAnsi="Courier New" w:cs="Courier New"/>
+          <w:sz w:val="22"/>
+          <w:lang w:val="en-US"/>
+        </w:rPr>
+        <w:t>            CLOSED.add(child)</w:t>
+      </w:r>
+    </w:p>
+    <w:p>
+      <w:pPr>
+        <w:ind w:firstLine="0"/>
+        <w:rPr>
+          <w:rFonts w:ascii="Courier New" w:hAnsi="Courier New" w:cs="Courier New"/>
+          <w:sz w:val="22"/>
+          <w:lang w:val="en-US"/>
+        </w:rPr>
+      </w:pPr>
+      <w:r>
+        <w:rPr>
+          <w:rFonts w:ascii="Courier New" w:hAnsi="Courier New" w:cs="Courier New"/>
+          <w:sz w:val="22"/>
+          <w:lang w:val="en-US"/>
+        </w:rPr>
+        <w:t>            parent[child] = (node, child_action)</w:t>
+      </w:r>
+    </w:p>
+    <w:p>
+      <w:pPr>
+        <w:ind w:firstLine="0"/>
+        <w:rPr>
+          <w:rFonts w:ascii="Courier New" w:hAnsi="Courier New" w:cs="Courier New"/>
+          <w:sz w:val="22"/>
+          <w:lang w:val="en-US"/>
+        </w:rPr>
+      </w:pPr>
+      <w:r>
+        <w:rPr>
+          <w:rFonts w:ascii="Courier New" w:hAnsi="Courier New" w:cs="Courier New"/>
+          <w:sz w:val="22"/>
+          <w:lang w:val="en-US"/>
+        </w:rPr>
+        <w:t xml:space="preserve">            </w:t>
+      </w:r>
+    </w:p>
+    <w:p>
+      <w:pPr>
+        <w:ind w:firstLine="0"/>
+        <w:rPr>
+          <w:rFonts w:ascii="Courier New" w:hAnsi="Courier New" w:cs="Courier New"/>
+          <w:sz w:val="22"/>
+          <w:lang w:val="en-US"/>
+        </w:rPr>
+      </w:pPr>
+      <w:r>
+        <w:rPr>
+          <w:rFonts w:ascii="Courier New" w:hAnsi="Courier New" w:cs="Courier New"/>
+          <w:sz w:val="22"/>
+          <w:lang w:val="en-US"/>
+        </w:rPr>
+        <w:t>            OPEN.push((child, child_action))</w:t>
+      </w:r>
+    </w:p>
+    <w:p>
+      <w:pPr>
+        <w:ind w:firstLine="0"/>
+        <w:rPr>
+          <w:rFonts w:ascii="Courier New" w:hAnsi="Courier New" w:cs="Courier New"/>
+          <w:sz w:val="22"/>
+          <w:lang w:val="en-US"/>
+        </w:rPr>
+      </w:pPr>
+    </w:p>
+    <w:p>
+      <w:pPr>
+        <w:ind w:firstLine="0"/>
+        <w:rPr>
+          <w:lang w:val="en-US"/>
+        </w:rPr>
+      </w:pPr>
+      <w:r>
+        <w:rPr>
+          <w:rFonts w:ascii="Courier New" w:hAnsi="Courier New" w:cs="Courier New"/>
+          <w:sz w:val="22"/>
+          <w:lang w:val="en-US"/>
+        </w:rPr>
+        <w:t xml:space="preserve">    </w:t>
+      </w:r>
+      <w:r>
+        <w:rPr>
+          <w:rFonts w:ascii="Courier New" w:hAnsi="Courier New" w:cs="Courier New"/>
+          <w:sz w:val="22"/>
+          <w:lang w:val="en-US"/>
+        </w:rPr>
+        <w:t>return []</w:t>
+      </w:r>
+    </w:p>
+    <w:p>
+      <w:pPr>
+        <w:ind w:firstLine="0"/>
+        <w:rPr>
+          <w:lang w:val="en-US"/>
+        </w:rPr>
+      </w:pPr>
+    </w:p>
+    <w:p>
+      <w:pPr>
+        <w:ind w:firstLine="0"/>
+        <w:rPr>
+          <w:lang w:val="en-US"/>
+        </w:rPr>
+      </w:pPr>
+      <w:r>
+        <w:t>Листинг</w:t>
+      </w:r>
+      <w:r>
+        <w:rPr>
+          <w:lang w:val="en-US"/>
+        </w:rPr>
+        <w:t xml:space="preserve"> 4 – </w:t>
+      </w:r>
+      <w:r>
+        <w:t>Поиск</w:t>
+      </w:r>
+      <w:r>
+        <w:rPr>
+          <w:lang w:val="en-US"/>
+        </w:rPr>
+        <w:t xml:space="preserve"> </w:t>
+      </w:r>
+      <w:r>
+        <w:t>обратного</w:t>
+      </w:r>
+      <w:r>
+        <w:rPr>
+          <w:lang w:val="en-US"/>
+        </w:rPr>
+        <w:t xml:space="preserve"> </w:t>
+      </w:r>
+      <w:r>
+        <w:t>пути</w:t>
+      </w:r>
+    </w:p>
+    <w:p>
+      <w:pPr>
+        <w:ind w:firstLine="0"/>
+        <w:rPr>
+          <w:rFonts w:ascii="Courier New" w:hAnsi="Courier New" w:cs="Courier New"/>
+          <w:sz w:val="22"/>
+          <w:lang w:val="en-US"/>
+        </w:rPr>
+      </w:pPr>
+      <w:r>
+        <w:rPr>
+          <w:rFonts w:ascii="Courier New" w:hAnsi="Courier New" w:cs="Courier New"/>
+          <w:sz w:val="22"/>
+          <w:lang w:val="en-US"/>
+        </w:rPr>
+        <w:t>def Path(problem, node, parent):</w:t>
+      </w:r>
+    </w:p>
+    <w:p>
+      <w:pPr>
+        <w:ind w:firstLine="0"/>
+        <w:rPr>
+          <w:rFonts w:ascii="Courier New" w:hAnsi="Courier New" w:cs="Courier New"/>
+          <w:sz w:val="22"/>
+          <w:lang w:val="en-US"/>
+        </w:rPr>
+      </w:pPr>
+      <w:r>
+        <w:rPr>
+          <w:rFonts w:ascii="Courier New" w:hAnsi="Courier New" w:cs="Courier New"/>
+          <w:sz w:val="22"/>
+          <w:lang w:val="en-US"/>
+        </w:rPr>
+        <w:t>    how_to_get_home = []</w:t>
+      </w:r>
+    </w:p>
+    <w:p>
+      <w:pPr>
+        <w:ind w:firstLine="0"/>
+        <w:rPr>
+          <w:rFonts w:ascii="Courier New" w:hAnsi="Courier New" w:cs="Courier New"/>
+          <w:sz w:val="22"/>
+          <w:lang w:val="en-US"/>
+        </w:rPr>
+      </w:pPr>
+      <w:r>
+        <w:rPr>
+          <w:rFonts w:ascii="Courier New" w:hAnsi="Courier New" w:cs="Courier New"/>
+          <w:sz w:val="22"/>
+          <w:lang w:val="en-US"/>
+        </w:rPr>
+        <w:t>    start = problem.getStartState()</w:t>
+      </w:r>
+    </w:p>
+    <w:p>
+      <w:pPr>
+        <w:ind w:firstLine="0"/>
+        <w:rPr>
+          <w:rFonts w:ascii="Courier New" w:hAnsi="Courier New" w:cs="Courier New"/>
+          <w:sz w:val="22"/>
+          <w:lang w:val="en-US"/>
+        </w:rPr>
+      </w:pPr>
+    </w:p>
+    <w:p>
+      <w:pPr>
+        <w:ind w:firstLine="0"/>
+        <w:rPr>
+          <w:rFonts w:ascii="Courier New" w:hAnsi="Courier New" w:cs="Courier New"/>
+          <w:sz w:val="22"/>
+          <w:lang w:val="en-US"/>
+        </w:rPr>
+      </w:pPr>
+      <w:r>
+        <w:rPr>
+          <w:rFonts w:ascii="Courier New" w:hAnsi="Courier New" w:cs="Courier New"/>
+          <w:sz w:val="22"/>
+          <w:lang w:val="en-US"/>
+        </w:rPr>
+        <w:t>    while node != start:</w:t>
+      </w:r>
+    </w:p>
+    <w:p>
+      <w:pPr>
+        <w:ind w:firstLine="0"/>
+        <w:rPr>
+          <w:rFonts w:ascii="Courier New" w:hAnsi="Courier New" w:cs="Courier New"/>
+          <w:sz w:val="22"/>
+          <w:lang w:val="en-US"/>
+        </w:rPr>
+      </w:pPr>
+      <w:r>
+        <w:rPr>
+          <w:rFonts w:ascii="Courier New" w:hAnsi="Courier New" w:cs="Courier New"/>
+          <w:sz w:val="22"/>
+          <w:lang w:val="en-US"/>
+        </w:rPr>
+        <w:t>        prev, action = parent[node]</w:t>
+      </w:r>
+    </w:p>
+    <w:p>
+      <w:pPr>
+        <w:ind w:firstLine="0"/>
+        <w:rPr>
+          <w:rFonts w:ascii="Courier New" w:hAnsi="Courier New" w:cs="Courier New"/>
+          <w:sz w:val="22"/>
+          <w:lang w:val="en-US"/>
+        </w:rPr>
+      </w:pPr>
+      <w:r>
+        <w:rPr>
+          <w:rFonts w:ascii="Courier New" w:hAnsi="Courier New" w:cs="Courier New"/>
+          <w:sz w:val="22"/>
+          <w:lang w:val="en-US"/>
+        </w:rPr>
+        <w:t>        how_to_get_home.append(action)</w:t>
+      </w:r>
+    </w:p>
+    <w:p>
+      <w:pPr>
+        <w:ind w:firstLine="0"/>
+        <w:rPr>
+          <w:rFonts w:ascii="Courier New" w:hAnsi="Courier New" w:cs="Courier New"/>
+          <w:sz w:val="22"/>
+          <w:lang w:val="en-US"/>
+        </w:rPr>
+      </w:pPr>
+      <w:r>
+        <w:rPr>
+          <w:rFonts w:ascii="Courier New" w:hAnsi="Courier New" w:cs="Courier New"/>
+          <w:sz w:val="22"/>
+          <w:lang w:val="en-US"/>
+        </w:rPr>
+        <w:t>        node = prev</w:t>
+      </w:r>
+    </w:p>
+    <w:p>
+      <w:pPr>
+        <w:ind w:firstLine="0"/>
+        <w:rPr>
+          <w:rFonts w:ascii="Courier New" w:hAnsi="Courier New" w:cs="Courier New"/>
+          <w:sz w:val="22"/>
+          <w:lang w:val="en-US"/>
+        </w:rPr>
+      </w:pPr>
+    </w:p>
+    <w:p>
+      <w:pPr>
+        <w:ind w:firstLine="0"/>
+        <w:rPr>
+          <w:rFonts w:ascii="Courier New" w:hAnsi="Courier New" w:cs="Courier New"/>
+          <w:sz w:val="22"/>
+          <w:lang w:val="en-US"/>
+        </w:rPr>
+      </w:pPr>
+      <w:r>
+        <w:rPr>
+          <w:rFonts w:ascii="Courier New" w:hAnsi="Courier New" w:cs="Courier New"/>
+          <w:sz w:val="22"/>
+          <w:lang w:val="en-US"/>
+        </w:rPr>
+        <w:t>    return how_to_get_home[::-1]</w:t>
+      </w:r>
+    </w:p>
+    <w:p>
+      <w:pPr>
+        <w:ind w:firstLine="0"/>
+        <w:jc w:val="center"/>
+      </w:pPr>
+    </w:p>
+    <w:p>
+      <w:pPr>
+        <w:ind w:firstLine="0"/>
+        <w:jc w:val="center"/>
+      </w:pPr>
+      <w:r>
+        <w:drawing>
+          <wp:inline distT="0" distB="0" distL="0" distR="0" wp14:anchorId="7518685D" wp14:editId="5545ADD1">
+            <wp:extent cx="5940425" cy="1209040"/>
+            <wp:effectExtent l="0" t="0" r="3175" b="0"/>
+            <wp:docPr id="1192419276" name="Рисунок 1"/>
+            <wp:cNvGraphicFramePr>
+              <a:graphicFrameLocks xmlns:a="http://schemas.openxmlformats.org/drawingml/2006/main" noChangeAspect="1"/>
+            </wp:cNvGraphicFramePr>
+            <a:graphic xmlns:a="http://schemas.openxmlformats.org/drawingml/2006/main">
+              <a:graphicData uri="http://schemas.openxmlformats.org/drawingml/2006/picture">
+                <pic:pic xmlns:pic="http://schemas.openxmlformats.org/drawingml/2006/picture">
+                  <pic:nvPicPr>
+                    <pic:cNvPr id="1192419276" name=""/>
+                    <pic:cNvPicPr/>
+                  </pic:nvPicPr>
+                  <pic:blipFill>
+                    <a:blip r:embed="rId9"/>
+                    <a:stretch>
+                      <a:fillRect/>
+                    </a:stretch>
+                  </pic:blipFill>
+                  <pic:spPr>
+                    <a:xfrm>
+                      <a:off x="0" y="0"/>
+                      <a:ext cx="5940425" cy="1209040"/>
+                    </a:xfrm>
+                    <a:prstGeom prst="rect">
+                      <a:avLst/>
+                    </a:prstGeom>
+                  </pic:spPr>
+                </pic:pic>
+              </a:graphicData>
+            </a:graphic>
+          </wp:inline>
+        </w:drawing>
+      </w:r>
+    </w:p>
+    <w:p>
+      <w:pPr>
+        <w:ind w:firstLine="0"/>
+        <w:jc w:val="center"/>
+      </w:pPr>
+      <w:r>
+        <w:t xml:space="preserve">Рисунок </w:t>
+      </w:r>
+      <w:r>
+        <w:t>5</w:t>
+      </w:r>
+      <w:r>
+        <w:t xml:space="preserve"> – Прохождение алгоритмом поиска в </w:t>
+      </w:r>
+      <w:r>
+        <w:t>ширину</w:t>
+      </w:r>
+      <w:r>
+        <w:t xml:space="preserve"> </w:t>
+      </w:r>
+      <w:r>
+        <w:t xml:space="preserve">среднего </w:t>
+      </w:r>
+      <w:r>
+        <w:t>лабиринта</w:t>
+      </w:r>
+    </w:p>
+    <w:p>
+      <w:pPr>
+        <w:ind w:firstLine="0"/>
+        <w:jc w:val="center"/>
+      </w:pPr>
+    </w:p>
+    <w:p>
+      <w:pPr>
+        <w:ind w:firstLine="0"/>
+        <w:jc w:val="center"/>
+      </w:pPr>
+      <w:r>
+        <w:drawing>
+          <wp:inline distT="0" distB="0" distL="0" distR="0" wp14:anchorId="076C2456" wp14:editId="6BDDFFB4">
+            <wp:extent cx="5940425" cy="1191895"/>
+            <wp:effectExtent l="0" t="0" r="3175" b="8255"/>
+            <wp:docPr id="569080049" name="Рисунок 1"/>
+            <wp:cNvGraphicFramePr>
+              <a:graphicFrameLocks xmlns:a="http://schemas.openxmlformats.org/drawingml/2006/main" noChangeAspect="1"/>
+            </wp:cNvGraphicFramePr>
+            <a:graphic xmlns:a="http://schemas.openxmlformats.org/drawingml/2006/main">
+              <a:graphicData uri="http://schemas.openxmlformats.org/drawingml/2006/picture">
+                <pic:pic xmlns:pic="http://schemas.openxmlformats.org/drawingml/2006/picture">
+                  <pic:nvPicPr>
+                    <pic:cNvPr id="569080049" name=""/>
+                    <pic:cNvPicPr/>
+                  </pic:nvPicPr>
+                  <pic:blipFill>
+                    <a:blip r:embed="rId10"/>
+                    <a:stretch>
+                      <a:fillRect/>
+                    </a:stretch>
+                  </pic:blipFill>
+                  <pic:spPr>
+                    <a:xfrm>
+                      <a:off x="0" y="0"/>
+                      <a:ext cx="5940425" cy="1191895"/>
+                    </a:xfrm>
+                    <a:prstGeom prst="rect">
+                      <a:avLst/>
+                    </a:prstGeom>
+                  </pic:spPr>
+                </pic:pic>
+              </a:graphicData>
+            </a:graphic>
+          </wp:inline>
+        </w:drawing>
+      </w:r>
+    </w:p>
+    <w:p>
+      <w:pPr>
+        <w:ind w:firstLine="0"/>
+        <w:jc w:val="center"/>
+      </w:pPr>
+      <w:r>
+        <w:t xml:space="preserve">Рисунок </w:t>
+      </w:r>
+      <w:r>
+        <w:t>6</w:t>
+      </w:r>
+      <w:r>
+        <w:t xml:space="preserve"> – Прохождение алгоритмом поиска в ширину </w:t>
+      </w:r>
+      <w:r>
+        <w:t>большого</w:t>
+      </w:r>
+      <w:r>
+        <w:t xml:space="preserve"> лабиринта</w:t>
+      </w:r>
+    </w:p>
+    <w:p>
+      <w:pPr>
+        <w:ind w:firstLine="0"/>
+      </w:pPr>
+    </w:p>
+    <w:p>
+      <w:pPr>
+        <w:ind w:firstLine="0"/>
+        <w:jc w:val="center"/>
+      </w:pPr>
+      <w:r>
+        <w:drawing>
+          <wp:inline distT="0" distB="0" distL="0" distR="0" wp14:anchorId="508A7840" wp14:editId="50AFE839">
+            <wp:extent cx="5940425" cy="2655570"/>
+            <wp:effectExtent l="0" t="0" r="3175" b="0"/>
+            <wp:docPr id="220253907" name="Рисунок 1"/>
+            <wp:cNvGraphicFramePr>
+              <a:graphicFrameLocks xmlns:a="http://schemas.openxmlformats.org/drawingml/2006/main" noChangeAspect="1"/>
+            </wp:cNvGraphicFramePr>
+            <a:graphic xmlns:a="http://schemas.openxmlformats.org/drawingml/2006/main">
+              <a:graphicData uri="http://schemas.openxmlformats.org/drawingml/2006/picture">
+                <pic:pic xmlns:pic="http://schemas.openxmlformats.org/drawingml/2006/picture">
+                  <pic:nvPicPr>
+                    <pic:cNvPr id="220253907" name=""/>
+                    <pic:cNvPicPr/>
+                  </pic:nvPicPr>
+                  <pic:blipFill>
+                    <a:blip r:embed="rId11"/>
+                    <a:stretch>
+                      <a:fillRect/>
+                    </a:stretch>
+                  </pic:blipFill>
+                  <pic:spPr>
+                    <a:xfrm>
+                      <a:off x="0" y="0"/>
+                      <a:ext cx="5940425" cy="2655570"/>
+                    </a:xfrm>
+                    <a:prstGeom prst="rect">
+                      <a:avLst/>
+                    </a:prstGeom>
+                  </pic:spPr>
+                </pic:pic>
+              </a:graphicData>
+            </a:graphic>
+          </wp:inline>
+        </w:drawing>
+      </w:r>
+    </w:p>
+    <w:p>
+      <w:pPr>
+        <w:ind w:firstLine="0"/>
+        <w:jc w:val="center"/>
+      </w:pPr>
+      <w:r>
+        <w:t xml:space="preserve">Рисунок </w:t>
+      </w:r>
+      <w:r>
+        <w:t>7</w:t>
+      </w:r>
+      <w:r>
+        <w:t xml:space="preserve"> – Прохождение авто оценщика для алгоритма поиска в </w:t>
+      </w:r>
+      <w:r>
+        <w:t>ширину</w:t>
+      </w:r>
+    </w:p>
+    <w:p>
+      <w:pPr>
+        <w:ind w:firstLine="0"/>
+        <w:jc w:val="center"/>
+      </w:pPr>
+    </w:p>
+    <w:p>
+      <w:pPr>
+        <w:ind w:firstLine="0"/>
+      </w:pPr>
+    </w:p>
+    <w:p>
+      <w:r>
+        <w:lastRenderedPageBreak/>
+        <w:t xml:space="preserve">3. Реализация поиска по весам. Для этого алгоритма </w:t>
+      </w:r>
+      <w:r>
+        <w:t xml:space="preserve">(Листинг 5) </w:t>
+      </w:r>
+      <w:r>
+        <w:t xml:space="preserve">был взят алгоритм поиска в ширину, исключён обратный поиск в пользу выбора узла </w:t>
+      </w:r>
+      <w:r>
+        <w:t>с наименьшим весом (Листинг 6).</w:t>
+      </w:r>
+      <w:r>
+        <w:t xml:space="preserve"> </w:t>
+      </w:r>
+      <w:r>
+        <w:t xml:space="preserve">Тесты пройдены (Рисунок </w:t>
+      </w:r>
+      <w:r>
+        <w:t>8</w:t>
+      </w:r>
+      <w:r>
+        <w:t xml:space="preserve"> – </w:t>
+      </w:r>
+      <w:r>
+        <w:t>10</w:t>
+      </w:r>
+      <w:r>
+        <w:t>).</w:t>
+      </w:r>
+    </w:p>
+    <w:p>
+      <w:pPr>
+        <w:ind w:firstLine="0"/>
+      </w:pPr>
+    </w:p>
+    <w:p>
+      <w:pPr>
+        <w:ind w:firstLine="0"/>
+      </w:pPr>
+      <w:r>
+        <w:t>Листинг 5 – Функция поиска по весам</w:t>
+      </w:r>
+    </w:p>
+    <w:p>
+      <w:pPr>
+        <w:pStyle w:val="a5"/>
+        <w:jc w:val="both"/>
+        <w:rPr>
+          <w:rFonts w:ascii="Courier New" w:hAnsi="Courier New" w:cs="Courier New"/>
+          <w:b w:val="0"/>
+          <w:bCs/>
+          <w:sz w:val="22"/>
+        </w:rPr>
+      </w:pPr>
+      <w:r>
+        <w:rPr>
+          <w:rFonts w:ascii="Courier New" w:hAnsi="Courier New" w:cs="Courier New"/>
+          <w:b w:val="0"/>
+          <w:bCs/>
+          <w:sz w:val="22"/>
+          <w:lang w:val="en-US"/>
+        </w:rPr>
+        <w:t>def</w:t>
+      </w:r>
+      <w:r>
+        <w:rPr>
+          <w:rFonts w:ascii="Courier New" w:hAnsi="Courier New" w:cs="Courier New"/>
+          <w:b w:val="0"/>
+          <w:bCs/>
+          <w:sz w:val="22"/>
+        </w:rPr>
+        <w:t xml:space="preserve"> </w:t>
+      </w:r>
+      <w:r>
+        <w:rPr>
+          <w:rFonts w:ascii="Courier New" w:hAnsi="Courier New" w:cs="Courier New"/>
+          <w:b w:val="0"/>
+          <w:bCs/>
+          <w:sz w:val="22"/>
+          <w:lang w:val="en-US"/>
+        </w:rPr>
+        <w:t>uniformCostSearch</w:t>
+      </w:r>
+      <w:r>
+        <w:rPr>
+          <w:rFonts w:ascii="Courier New" w:hAnsi="Courier New" w:cs="Courier New"/>
+          <w:b w:val="0"/>
+          <w:bCs/>
+          <w:sz w:val="22"/>
+        </w:rPr>
+        <w:t>(</w:t>
+      </w:r>
+      <w:r>
+        <w:rPr>
+          <w:rFonts w:ascii="Courier New" w:hAnsi="Courier New" w:cs="Courier New"/>
+          <w:b w:val="0"/>
+          <w:bCs/>
+          <w:sz w:val="22"/>
+          <w:lang w:val="en-US"/>
+        </w:rPr>
+        <w:t>problem</w:t>
+      </w:r>
+      <w:r>
+        <w:rPr>
+          <w:rFonts w:ascii="Courier New" w:hAnsi="Courier New" w:cs="Courier New"/>
+          <w:b w:val="0"/>
+          <w:bCs/>
+          <w:sz w:val="22"/>
+        </w:rPr>
+        <w:t>):</w:t>
+      </w:r>
+    </w:p>
+    <w:p>
+      <w:pPr>
+        <w:pStyle w:val="a5"/>
+        <w:jc w:val="both"/>
+        <w:rPr>
+          <w:rFonts w:ascii="Courier New" w:hAnsi="Courier New" w:cs="Courier New"/>
+          <w:b w:val="0"/>
+          <w:bCs/>
+          <w:sz w:val="22"/>
+          <w:lang w:val="en-US"/>
+        </w:rPr>
+      </w:pPr>
+      <w:r>
+        <w:rPr>
+          <w:rFonts w:ascii="Courier New" w:hAnsi="Courier New" w:cs="Courier New"/>
+          <w:b w:val="0"/>
+          <w:bCs/>
+          <w:sz w:val="22"/>
+          <w:lang w:val="en-US"/>
+        </w:rPr>
+        <w:t> </w:t>
+      </w:r>
+      <w:r>
+        <w:rPr>
+          <w:rFonts w:ascii="Courier New" w:hAnsi="Courier New" w:cs="Courier New"/>
+          <w:b w:val="0"/>
+          <w:bCs/>
+          <w:sz w:val="22"/>
+        </w:rPr>
+        <w:t xml:space="preserve"> </w:t>
+      </w:r>
+      <w:r>
+        <w:rPr>
+          <w:rFonts w:ascii="Courier New" w:hAnsi="Courier New" w:cs="Courier New"/>
+          <w:b w:val="0"/>
+          <w:bCs/>
+          <w:sz w:val="22"/>
+          <w:lang w:val="en-US"/>
+        </w:rPr>
+        <w:t> </w:t>
+      </w:r>
+      <w:r>
+        <w:rPr>
+          <w:rFonts w:ascii="Courier New" w:hAnsi="Courier New" w:cs="Courier New"/>
+          <w:b w:val="0"/>
+          <w:bCs/>
+          <w:sz w:val="22"/>
+        </w:rPr>
+        <w:t xml:space="preserve"> </w:t>
+      </w:r>
+      <w:r>
+        <w:rPr>
+          <w:rFonts w:ascii="Courier New" w:hAnsi="Courier New" w:cs="Courier New"/>
+          <w:b w:val="0"/>
+          <w:bCs/>
+          <w:sz w:val="22"/>
+          <w:lang w:val="en-US"/>
+        </w:rPr>
+        <w:t>start = problem.getStartState()</w:t>
+      </w:r>
+    </w:p>
+    <w:p>
+      <w:pPr>
+        <w:pStyle w:val="a5"/>
+        <w:jc w:val="both"/>
+        <w:rPr>
+          <w:rFonts w:ascii="Courier New" w:hAnsi="Courier New" w:cs="Courier New"/>
+          <w:b w:val="0"/>
+          <w:bCs/>
+          <w:sz w:val="22"/>
+          <w:lang w:val="en-US"/>
+        </w:rPr>
+      </w:pPr>
+      <w:r>
+        <w:rPr>
+          <w:rFonts w:ascii="Courier New" w:hAnsi="Courier New" w:cs="Courier New"/>
+          <w:b w:val="0"/>
+          <w:bCs/>
+          <w:sz w:val="22"/>
+          <w:lang w:val="en-US"/>
+        </w:rPr>
+        <w:t>    OPEN = util.PriorityQueue()</w:t>
+      </w:r>
+    </w:p>
+    <w:p>
+      <w:pPr>
+        <w:pStyle w:val="a5"/>
+        <w:jc w:val="both"/>
+        <w:rPr>
+          <w:rFonts w:ascii="Courier New" w:hAnsi="Courier New" w:cs="Courier New"/>
+          <w:b w:val="0"/>
+          <w:bCs/>
+          <w:sz w:val="22"/>
+          <w:lang w:val="en-US"/>
+        </w:rPr>
+      </w:pPr>
+      <w:r>
+        <w:rPr>
+          <w:rFonts w:ascii="Courier New" w:hAnsi="Courier New" w:cs="Courier New"/>
+          <w:b w:val="0"/>
+          <w:bCs/>
+          <w:sz w:val="22"/>
+          <w:lang w:val="en-US"/>
+        </w:rPr>
+        <w:t>    best_cost = {start: 0}</w:t>
+      </w:r>
+    </w:p>
+    <w:p>
+      <w:pPr>
+        <w:pStyle w:val="a5"/>
+        <w:jc w:val="both"/>
+        <w:rPr>
+          <w:rFonts w:ascii="Courier New" w:hAnsi="Courier New" w:cs="Courier New"/>
+          <w:b w:val="0"/>
+          <w:bCs/>
+          <w:sz w:val="22"/>
+          <w:lang w:val="en-US"/>
+        </w:rPr>
+      </w:pPr>
+      <w:r>
+        <w:rPr>
+          <w:rFonts w:ascii="Courier New" w:hAnsi="Courier New" w:cs="Courier New"/>
+          <w:b w:val="0"/>
+          <w:bCs/>
+          <w:sz w:val="22"/>
+          <w:lang w:val="en-US"/>
+        </w:rPr>
+        <w:t>    CLOSED = set()</w:t>
+      </w:r>
+    </w:p>
+    <w:p>
+      <w:pPr>
+        <w:pStyle w:val="a5"/>
+        <w:jc w:val="both"/>
+        <w:rPr>
+          <w:rFonts w:ascii="Courier New" w:hAnsi="Courier New" w:cs="Courier New"/>
+          <w:b w:val="0"/>
+          <w:bCs/>
+          <w:sz w:val="22"/>
+          <w:lang w:val="en-US"/>
+        </w:rPr>
+      </w:pPr>
+    </w:p>
+    <w:p>
+      <w:pPr>
+        <w:pStyle w:val="a5"/>
+        <w:jc w:val="both"/>
+        <w:rPr>
+          <w:rFonts w:ascii="Courier New" w:hAnsi="Courier New" w:cs="Courier New"/>
+          <w:b w:val="0"/>
+          <w:bCs/>
+          <w:sz w:val="22"/>
+          <w:lang w:val="en-US"/>
+        </w:rPr>
+      </w:pPr>
+      <w:r>
+        <w:rPr>
+          <w:rFonts w:ascii="Courier New" w:hAnsi="Courier New" w:cs="Courier New"/>
+          <w:b w:val="0"/>
+          <w:bCs/>
+          <w:sz w:val="22"/>
+          <w:lang w:val="en-US"/>
+        </w:rPr>
+        <w:t xml:space="preserve">    OPEN.push((start, [], 0), 0) </w:t>
+      </w:r>
+    </w:p>
+    <w:p>
+      <w:pPr>
+        <w:pStyle w:val="a5"/>
+        <w:jc w:val="both"/>
+        <w:rPr>
+          <w:rFonts w:ascii="Courier New" w:hAnsi="Courier New" w:cs="Courier New"/>
+          <w:b w:val="0"/>
+          <w:bCs/>
+          <w:sz w:val="22"/>
+          <w:lang w:val="en-US"/>
+        </w:rPr>
+      </w:pPr>
+    </w:p>
+    <w:p>
+      <w:pPr>
+        <w:pStyle w:val="a5"/>
+        <w:jc w:val="both"/>
+        <w:rPr>
+          <w:rFonts w:ascii="Courier New" w:hAnsi="Courier New" w:cs="Courier New"/>
+          <w:b w:val="0"/>
+          <w:bCs/>
+          <w:sz w:val="22"/>
+          <w:lang w:val="en-US"/>
+        </w:rPr>
+      </w:pPr>
+      <w:r>
+        <w:rPr>
+          <w:rFonts w:ascii="Courier New" w:hAnsi="Courier New" w:cs="Courier New"/>
+          <w:b w:val="0"/>
+          <w:bCs/>
+          <w:sz w:val="22"/>
+          <w:lang w:val="en-US"/>
+        </w:rPr>
+        <w:t>    while not OPEN.isEmpty():</w:t>
+      </w:r>
+    </w:p>
+    <w:p>
+      <w:pPr>
+        <w:pStyle w:val="a5"/>
+        <w:jc w:val="both"/>
+        <w:rPr>
+          <w:rFonts w:ascii="Courier New" w:hAnsi="Courier New" w:cs="Courier New"/>
+          <w:b w:val="0"/>
+          <w:bCs/>
+          <w:sz w:val="22"/>
+          <w:lang w:val="en-US"/>
+        </w:rPr>
+      </w:pPr>
+      <w:r>
+        <w:rPr>
+          <w:rFonts w:ascii="Courier New" w:hAnsi="Courier New" w:cs="Courier New"/>
+          <w:b w:val="0"/>
+          <w:bCs/>
+          <w:sz w:val="22"/>
+          <w:lang w:val="en-US"/>
+        </w:rPr>
+        <w:t>        state, path, cost = OPEN.pop()</w:t>
+      </w:r>
+    </w:p>
+    <w:p>
+      <w:pPr>
+        <w:pStyle w:val="a5"/>
+        <w:jc w:val="both"/>
+        <w:rPr>
+          <w:rFonts w:ascii="Courier New" w:hAnsi="Courier New" w:cs="Courier New"/>
+          <w:b w:val="0"/>
+          <w:bCs/>
+          <w:sz w:val="22"/>
+          <w:lang w:val="en-US"/>
+        </w:rPr>
+      </w:pPr>
+    </w:p>
+    <w:p>
+      <w:pPr>
+        <w:pStyle w:val="a5"/>
+        <w:jc w:val="both"/>
+        <w:rPr>
+          <w:rFonts w:ascii="Courier New" w:hAnsi="Courier New" w:cs="Courier New"/>
+          <w:b w:val="0"/>
+          <w:bCs/>
+          <w:sz w:val="22"/>
+          <w:lang w:val="en-US"/>
+        </w:rPr>
+      </w:pPr>
+      <w:r>
+        <w:rPr>
+          <w:rFonts w:ascii="Courier New" w:hAnsi="Courier New" w:cs="Courier New"/>
+          <w:b w:val="0"/>
+          <w:bCs/>
+          <w:sz w:val="22"/>
+          <w:lang w:val="en-US"/>
+        </w:rPr>
+        <w:t>        if cost &gt; best_cost.get(state, float('inf')): continue</w:t>
+      </w:r>
+    </w:p>
+    <w:p>
+      <w:pPr>
+        <w:pStyle w:val="a5"/>
+        <w:jc w:val="both"/>
+        <w:rPr>
+          <w:rFonts w:ascii="Courier New" w:hAnsi="Courier New" w:cs="Courier New"/>
+          <w:b w:val="0"/>
+          <w:bCs/>
+          <w:sz w:val="22"/>
+          <w:lang w:val="en-US"/>
+        </w:rPr>
+      </w:pPr>
+    </w:p>
+    <w:p>
+      <w:pPr>
+        <w:pStyle w:val="a5"/>
+        <w:jc w:val="both"/>
+        <w:rPr>
+          <w:rFonts w:ascii="Courier New" w:hAnsi="Courier New" w:cs="Courier New"/>
+          <w:b w:val="0"/>
+          <w:bCs/>
+          <w:sz w:val="22"/>
+          <w:lang w:val="en-US"/>
+        </w:rPr>
+      </w:pPr>
+      <w:r>
+        <w:rPr>
+          <w:rFonts w:ascii="Courier New" w:hAnsi="Courier New" w:cs="Courier New"/>
+          <w:b w:val="0"/>
+          <w:bCs/>
+          <w:sz w:val="22"/>
+          <w:lang w:val="en-US"/>
+        </w:rPr>
+        <w:t>        if problem.isGoalState(state): return path</w:t>
+      </w:r>
+    </w:p>
+    <w:p>
+      <w:pPr>
+        <w:pStyle w:val="a5"/>
+        <w:jc w:val="both"/>
+        <w:rPr>
+          <w:rFonts w:ascii="Courier New" w:hAnsi="Courier New" w:cs="Courier New"/>
+          <w:b w:val="0"/>
+          <w:bCs/>
+          <w:sz w:val="22"/>
+          <w:lang w:val="en-US"/>
+        </w:rPr>
+      </w:pPr>
+    </w:p>
+    <w:p>
+      <w:pPr>
+        <w:pStyle w:val="a5"/>
+        <w:jc w:val="both"/>
+        <w:rPr>
+          <w:rFonts w:ascii="Courier New" w:hAnsi="Courier New" w:cs="Courier New"/>
+          <w:b w:val="0"/>
+          <w:bCs/>
+          <w:sz w:val="22"/>
+          <w:lang w:val="en-US"/>
+        </w:rPr>
+      </w:pPr>
+      <w:r>
+        <w:rPr>
+          <w:rFonts w:ascii="Courier New" w:hAnsi="Courier New" w:cs="Courier New"/>
+          <w:b w:val="0"/>
+          <w:bCs/>
+          <w:sz w:val="22"/>
+          <w:lang w:val="en-US"/>
+        </w:rPr>
+        <w:t>        if state in CLOSED: continue</w:t>
+      </w:r>
+    </w:p>
+    <w:p>
+      <w:pPr>
+        <w:pStyle w:val="a5"/>
+        <w:jc w:val="both"/>
+        <w:rPr>
+          <w:rFonts w:ascii="Courier New" w:hAnsi="Courier New" w:cs="Courier New"/>
+          <w:b w:val="0"/>
+          <w:bCs/>
+          <w:sz w:val="22"/>
+          <w:lang w:val="en-US"/>
+        </w:rPr>
+      </w:pPr>
+      <w:r>
+        <w:rPr>
+          <w:rFonts w:ascii="Courier New" w:hAnsi="Courier New" w:cs="Courier New"/>
+          <w:b w:val="0"/>
+          <w:bCs/>
+          <w:sz w:val="22"/>
+          <w:lang w:val="en-US"/>
+        </w:rPr>
+        <w:t>        CLOSED.add(state)</w:t>
+      </w:r>
+    </w:p>
+    <w:p>
+      <w:pPr>
+        <w:pStyle w:val="a5"/>
+        <w:jc w:val="both"/>
+        <w:rPr>
+          <w:rFonts w:ascii="Courier New" w:hAnsi="Courier New" w:cs="Courier New"/>
+          <w:b w:val="0"/>
+          <w:bCs/>
+          <w:sz w:val="22"/>
+          <w:lang w:val="en-US"/>
+        </w:rPr>
+      </w:pPr>
+    </w:p>
+    <w:p>
+      <w:pPr>
+        <w:pStyle w:val="a5"/>
+        <w:jc w:val="both"/>
+        <w:rPr>
+          <w:rFonts w:ascii="Courier New" w:hAnsi="Courier New" w:cs="Courier New"/>
+          <w:b w:val="0"/>
+          <w:bCs/>
+          <w:sz w:val="22"/>
+          <w:lang w:val="en-US"/>
+        </w:rPr>
+      </w:pPr>
+      <w:r>
+        <w:rPr>
+          <w:rFonts w:ascii="Courier New" w:hAnsi="Courier New" w:cs="Courier New"/>
+          <w:b w:val="0"/>
+          <w:bCs/>
+          <w:sz w:val="22"/>
+          <w:lang w:val="en-US"/>
+        </w:rPr>
+        <w:t>        for succ, action, step_cost in problem.getSuccessors(state):</w:t>
+      </w:r>
+    </w:p>
+    <w:p>
+      <w:pPr>
+        <w:pStyle w:val="a5"/>
+        <w:jc w:val="both"/>
+        <w:rPr>
+          <w:rFonts w:ascii="Courier New" w:hAnsi="Courier New" w:cs="Courier New"/>
+          <w:b w:val="0"/>
+          <w:bCs/>
+          <w:sz w:val="22"/>
+          <w:lang w:val="en-US"/>
+        </w:rPr>
+      </w:pPr>
+      <w:r>
+        <w:rPr>
+          <w:rFonts w:ascii="Courier New" w:hAnsi="Courier New" w:cs="Courier New"/>
+          <w:b w:val="0"/>
+          <w:bCs/>
+          <w:sz w:val="22"/>
+          <w:lang w:val="en-US"/>
+        </w:rPr>
+        <w:t>            new_cost = cost + step_cost</w:t>
+      </w:r>
+    </w:p>
+    <w:p>
+      <w:pPr>
+        <w:pStyle w:val="a5"/>
+        <w:jc w:val="both"/>
+        <w:rPr>
+          <w:rFonts w:ascii="Courier New" w:hAnsi="Courier New" w:cs="Courier New"/>
+          <w:b w:val="0"/>
+          <w:bCs/>
+          <w:sz w:val="22"/>
+          <w:lang w:val="en-US"/>
+        </w:rPr>
+      </w:pPr>
+      <w:r>
+        <w:rPr>
+          <w:rFonts w:ascii="Courier New" w:hAnsi="Courier New" w:cs="Courier New"/>
+          <w:b w:val="0"/>
+          <w:bCs/>
+          <w:sz w:val="22"/>
+          <w:lang w:val="en-US"/>
+        </w:rPr>
+        <w:t>            if succ not in CLOSED and new_cost &lt; best_cost.get(succ, float('inf')):</w:t>
+      </w:r>
+    </w:p>
+    <w:p>
+      <w:pPr>
+        <w:pStyle w:val="a5"/>
+        <w:jc w:val="both"/>
+        <w:rPr>
+          <w:rFonts w:ascii="Courier New" w:hAnsi="Courier New" w:cs="Courier New"/>
+          <w:b w:val="0"/>
+          <w:bCs/>
+          <w:sz w:val="22"/>
+          <w:lang w:val="en-US"/>
+        </w:rPr>
+      </w:pPr>
+      <w:r>
+        <w:rPr>
+          <w:rFonts w:ascii="Courier New" w:hAnsi="Courier New" w:cs="Courier New"/>
+          <w:b w:val="0"/>
+          <w:bCs/>
+          <w:sz w:val="22"/>
+          <w:lang w:val="en-US"/>
+        </w:rPr>
+        <w:t>                best_cost[succ] = new_cost</w:t>
+      </w:r>
+    </w:p>
+    <w:p>
+      <w:pPr>
+        <w:pStyle w:val="a5"/>
+        <w:jc w:val="both"/>
+        <w:rPr>
+          <w:rFonts w:ascii="Courier New" w:hAnsi="Courier New" w:cs="Courier New"/>
+          <w:b w:val="0"/>
+          <w:bCs/>
+          <w:sz w:val="22"/>
+          <w:lang w:val="en-US"/>
+        </w:rPr>
+      </w:pPr>
+      <w:r>
+        <w:rPr>
+          <w:rFonts w:ascii="Courier New" w:hAnsi="Courier New" w:cs="Courier New"/>
+          <w:b w:val="0"/>
+          <w:bCs/>
+          <w:sz w:val="22"/>
+          <w:lang w:val="en-US"/>
+        </w:rPr>
+        <w:t>                OPEN.push((succ, path + [action], new_cost), new_cost)</w:t>
+      </w:r>
+    </w:p>
+    <w:p>
+      <w:pPr>
+        <w:pStyle w:val="a5"/>
+        <w:jc w:val="both"/>
+        <w:rPr>
+          <w:rFonts w:ascii="Courier New" w:hAnsi="Courier New" w:cs="Courier New"/>
+          <w:b w:val="0"/>
+          <w:bCs/>
+          <w:sz w:val="22"/>
+          <w:lang w:val="en-US"/>
+        </w:rPr>
+      </w:pPr>
+    </w:p>
+    <w:p>
+      <w:pPr>
+        <w:pStyle w:val="a5"/>
+        <w:jc w:val="both"/>
+        <w:rPr>
+          <w:rFonts w:ascii="Courier New" w:hAnsi="Courier New" w:cs="Courier New"/>
+          <w:b w:val="0"/>
+          <w:bCs/>
+          <w:sz w:val="22"/>
+        </w:rPr>
+      </w:pPr>
+      <w:r>
+        <w:rPr>
+          <w:rFonts w:ascii="Courier New" w:hAnsi="Courier New" w:cs="Courier New"/>
+          <w:b w:val="0"/>
+          <w:bCs/>
+          <w:sz w:val="22"/>
+          <w:lang w:val="en-US"/>
+        </w:rPr>
+        <w:t xml:space="preserve">    </w:t>
+      </w:r>
+      <w:r>
+        <w:rPr>
+          <w:rFonts w:ascii="Courier New" w:hAnsi="Courier New" w:cs="Courier New"/>
+          <w:b w:val="0"/>
+          <w:bCs/>
+          <w:sz w:val="22"/>
+        </w:rPr>
+        <w:t>return None</w:t>
+      </w:r>
+    </w:p>
+    <w:p>
+      <w:pPr>
+        <w:pStyle w:val="a5"/>
+        <w:jc w:val="both"/>
+      </w:pPr>
+    </w:p>
+    <w:p>
+      <w:pPr>
+        <w:pStyle w:val="a5"/>
+        <w:jc w:val="both"/>
+        <w:rPr>
+          <w:b w:val="0"/>
+          <w:bCs/>
+        </w:rPr>
+      </w:pPr>
+      <w:r>
+        <w:rPr>
+          <w:b w:val="0"/>
+          <w:bCs/>
+        </w:rPr>
+        <w:t xml:space="preserve">Листинг 6 </w:t>
+      </w:r>
+      <w:r>
+        <w:rPr>
+          <w:b w:val="0"/>
+          <w:bCs/>
+        </w:rPr>
+        <w:t>–</w:t>
+      </w:r>
+      <w:r>
+        <w:rPr>
+          <w:b w:val="0"/>
+          <w:bCs/>
+        </w:rPr>
+        <w:t xml:space="preserve"> </w:t>
+      </w:r>
+      <w:r>
+        <w:rPr>
+          <w:b w:val="0"/>
+          <w:bCs/>
+        </w:rPr>
+        <w:t>Сегмент выбора пути с наименьшим весом</w:t>
+      </w:r>
+    </w:p>
+    <w:p>
+      <w:pPr>
+        <w:pStyle w:val="a5"/>
+        <w:jc w:val="both"/>
+        <w:rPr>
+          <w:rFonts w:ascii="Courier New" w:hAnsi="Courier New" w:cs="Courier New"/>
+          <w:b w:val="0"/>
+          <w:bCs/>
+          <w:sz w:val="22"/>
+          <w:lang w:val="en-US"/>
+        </w:rPr>
+      </w:pPr>
+      <w:r>
+        <w:rPr>
+          <w:rFonts w:ascii="Courier New" w:hAnsi="Courier New" w:cs="Courier New"/>
+          <w:b w:val="0"/>
+          <w:bCs/>
+          <w:sz w:val="22"/>
+          <w:lang w:val="en-US"/>
+        </w:rPr>
+        <w:t>for succ, action, step_cost in problem.getSuccessors(state):</w:t>
+      </w:r>
+    </w:p>
+    <w:p>
+      <w:pPr>
+        <w:pStyle w:val="a5"/>
+        <w:jc w:val="both"/>
+        <w:rPr>
+          <w:rFonts w:ascii="Courier New" w:hAnsi="Courier New" w:cs="Courier New"/>
+          <w:b w:val="0"/>
+          <w:bCs/>
+          <w:sz w:val="22"/>
+          <w:lang w:val="en-US"/>
+        </w:rPr>
+      </w:pPr>
+      <w:r>
+        <w:rPr>
+          <w:rFonts w:ascii="Courier New" w:hAnsi="Courier New" w:cs="Courier New"/>
+          <w:b w:val="0"/>
+          <w:bCs/>
+          <w:sz w:val="22"/>
+          <w:lang w:val="en-US"/>
+        </w:rPr>
+        <w:t xml:space="preserve">       </w:t>
+      </w:r>
+      <w:r>
+        <w:rPr>
+          <w:rFonts w:ascii="Courier New" w:hAnsi="Courier New" w:cs="Courier New"/>
+          <w:b w:val="0"/>
+          <w:bCs/>
+          <w:sz w:val="22"/>
+          <w:lang w:val="en-US"/>
+        </w:rPr>
+        <w:t xml:space="preserve"> </w:t>
+      </w:r>
+      <w:r>
+        <w:rPr>
+          <w:rFonts w:ascii="Courier New" w:hAnsi="Courier New" w:cs="Courier New"/>
+          <w:b w:val="0"/>
+          <w:bCs/>
+          <w:sz w:val="22"/>
+          <w:lang w:val="en-US"/>
+        </w:rPr>
+        <w:t>new_cost = cost + step_cost</w:t>
+      </w:r>
+    </w:p>
+    <w:p>
+      <w:pPr>
+        <w:pStyle w:val="a5"/>
+        <w:jc w:val="both"/>
+        <w:rPr>
+          <w:rFonts w:ascii="Courier New" w:hAnsi="Courier New" w:cs="Courier New"/>
+          <w:b w:val="0"/>
+          <w:bCs/>
+          <w:sz w:val="22"/>
+          <w:lang w:val="en-US"/>
+        </w:rPr>
+      </w:pPr>
+      <w:r>
+        <w:rPr>
+          <w:rFonts w:ascii="Courier New" w:hAnsi="Courier New" w:cs="Courier New"/>
+          <w:b w:val="0"/>
+          <w:bCs/>
+          <w:sz w:val="22"/>
+          <w:lang w:val="en-US"/>
+        </w:rPr>
+        <w:t>     if succ not in CLOSED and new_cost &lt; best_cost.get(succ, float('inf')):</w:t>
+      </w:r>
+    </w:p>
+    <w:p>
+      <w:pPr>
+        <w:pStyle w:val="a5"/>
+        <w:jc w:val="both"/>
+        <w:rPr>
+          <w:rFonts w:ascii="Courier New" w:hAnsi="Courier New" w:cs="Courier New"/>
+          <w:b w:val="0"/>
+          <w:bCs/>
+          <w:sz w:val="22"/>
+          <w:lang w:val="en-US"/>
+        </w:rPr>
+      </w:pPr>
+      <w:r>
+        <w:rPr>
+          <w:rFonts w:ascii="Courier New" w:hAnsi="Courier New" w:cs="Courier New"/>
+          <w:b w:val="0"/>
+          <w:bCs/>
+          <w:sz w:val="22"/>
+          <w:lang w:val="en-US"/>
+        </w:rPr>
+        <w:t>        best_cost[succ] = new_cost</w:t>
+      </w:r>
+    </w:p>
+    <w:p>
+      <w:pPr>
+        <w:pStyle w:val="a5"/>
+        <w:jc w:val="both"/>
+        <w:rPr>
+          <w:rFonts w:ascii="Courier New" w:hAnsi="Courier New" w:cs="Courier New"/>
+          <w:b w:val="0"/>
+          <w:bCs/>
+          <w:sz w:val="22"/>
+          <w:lang w:val="en-US"/>
+        </w:rPr>
+      </w:pPr>
+      <w:r>
+        <w:rPr>
+          <w:rFonts w:ascii="Courier New" w:hAnsi="Courier New" w:cs="Courier New"/>
+          <w:b w:val="0"/>
+          <w:bCs/>
+          <w:sz w:val="22"/>
+          <w:lang w:val="en-US"/>
+        </w:rPr>
+        <w:t>        OPEN.push((succ, path + [action], new_cost), new_cost)</w:t>
+      </w:r>
+    </w:p>
+    <w:p>
+      <w:pPr>
+        <w:pStyle w:val="a5"/>
+        <w:rPr>
+          <w:b w:val="0"/>
+        </w:rPr>
+      </w:pPr>
+    </w:p>
+    <w:p>
+      <w:pPr>
+        <w:pStyle w:val="a5"/>
+        <w:rPr>
+          <w:b w:val="0"/>
+        </w:rPr>
+      </w:pPr>
+      <w:r>
+        <w:rPr>
+          <w:b w:val="0"/>
+        </w:rPr>
+        <w:lastRenderedPageBreak/>
+        <w:drawing>
+          <wp:inline distT="0" distB="0" distL="0" distR="0" wp14:anchorId="1C5A2915" wp14:editId="1363D2A5">
+            <wp:extent cx="5940425" cy="1203325"/>
+            <wp:effectExtent l="0" t="0" r="3175" b="0"/>
+            <wp:docPr id="50929913" name="Рисунок 1"/>
+            <wp:cNvGraphicFramePr>
+              <a:graphicFrameLocks xmlns:a="http://schemas.openxmlformats.org/drawingml/2006/main" noChangeAspect="1"/>
+            </wp:cNvGraphicFramePr>
+            <a:graphic xmlns:a="http://schemas.openxmlformats.org/drawingml/2006/main">
+              <a:graphicData uri="http://schemas.openxmlformats.org/drawingml/2006/picture">
+                <pic:pic xmlns:pic="http://schemas.openxmlformats.org/drawingml/2006/picture">
+                  <pic:nvPicPr>
+                    <pic:cNvPr id="50929913" name=""/>
+                    <pic:cNvPicPr/>
+                  </pic:nvPicPr>
+                  <pic:blipFill>
+                    <a:blip r:embed="rId12"/>
+                    <a:stretch>
+                      <a:fillRect/>
+                    </a:stretch>
+                  </pic:blipFill>
+                  <pic:spPr>
+                    <a:xfrm>
+                      <a:off x="0" y="0"/>
+                      <a:ext cx="5940425" cy="1203325"/>
+                    </a:xfrm>
+                    <a:prstGeom prst="rect">
+                      <a:avLst/>
+                    </a:prstGeom>
+                  </pic:spPr>
+                </pic:pic>
+              </a:graphicData>
+            </a:graphic>
+          </wp:inline>
+        </w:drawing>
+      </w:r>
+    </w:p>
+    <w:p>
+      <w:pPr>
+        <w:pStyle w:val="a5"/>
+        <w:rPr>
+          <w:b w:val="0"/>
+        </w:rPr>
+      </w:pPr>
+      <w:r>
+        <w:rPr>
+          <w:b w:val="0"/>
+        </w:rPr>
+        <w:t xml:space="preserve">Рисунок 8 </w:t>
+      </w:r>
+      <w:r>
+        <w:rPr>
+          <w:b w:val="0"/>
+        </w:rPr>
+        <w:t>–</w:t>
+      </w:r>
+      <w:r>
+        <w:rPr>
+          <w:b w:val="0"/>
+        </w:rPr>
+        <w:t xml:space="preserve"> </w:t>
+      </w:r>
+      <w:r>
+        <w:rPr>
+          <w:b w:val="0"/>
+        </w:rPr>
+        <w:t xml:space="preserve">Прохождение алгоритмом поиска в ширину </w:t>
+      </w:r>
+      <w:r>
+        <w:rPr>
+          <w:b w:val="0"/>
+        </w:rPr>
+        <w:t>среднего</w:t>
+      </w:r>
+      <w:r>
+        <w:rPr>
+          <w:b w:val="0"/>
+        </w:rPr>
+        <w:t xml:space="preserve"> лабиринта</w:t>
+      </w:r>
+    </w:p>
+    <w:p>
+      <w:pPr>
+        <w:pStyle w:val="a5"/>
+        <w:rPr>
+          <w:b w:val="0"/>
+        </w:rPr>
+      </w:pPr>
+    </w:p>
+    <w:p>
+      <w:pPr>
+        <w:pStyle w:val="a5"/>
+        <w:rPr>
+          <w:b w:val="0"/>
+        </w:rPr>
+      </w:pPr>
+      <w:r>
+        <w:rPr>
+          <w:b w:val="0"/>
+        </w:rPr>
+        <w:drawing>
+          <wp:inline distT="0" distB="0" distL="0" distR="0" wp14:anchorId="046F945E" wp14:editId="3AC2574A">
+            <wp:extent cx="5940425" cy="2002790"/>
+            <wp:effectExtent l="0" t="0" r="3175" b="0"/>
+            <wp:docPr id="1945404726" name="Рисунок 1"/>
+            <wp:cNvGraphicFramePr>
+              <a:graphicFrameLocks xmlns:a="http://schemas.openxmlformats.org/drawingml/2006/main" noChangeAspect="1"/>
+            </wp:cNvGraphicFramePr>
+            <a:graphic xmlns:a="http://schemas.openxmlformats.org/drawingml/2006/main">
+              <a:graphicData uri="http://schemas.openxmlformats.org/drawingml/2006/picture">
+                <pic:pic xmlns:pic="http://schemas.openxmlformats.org/drawingml/2006/picture">
+                  <pic:nvPicPr>
+                    <pic:cNvPr id="1945404726" name=""/>
+                    <pic:cNvPicPr/>
+                  </pic:nvPicPr>
+                  <pic:blipFill>
+                    <a:blip r:embed="rId13"/>
+                    <a:stretch>
+                      <a:fillRect/>
+                    </a:stretch>
+                  </pic:blipFill>
+                  <pic:spPr>
+                    <a:xfrm>
+                      <a:off x="0" y="0"/>
+                      <a:ext cx="5940425" cy="2002790"/>
+                    </a:xfrm>
+                    <a:prstGeom prst="rect">
+                      <a:avLst/>
+                    </a:prstGeom>
+                  </pic:spPr>
+                </pic:pic>
+              </a:graphicData>
+            </a:graphic>
+          </wp:inline>
+        </w:drawing>
+      </w:r>
+      <w:r>
+        <w:rPr>
+          <w:b w:val="0"/>
+        </w:rPr>
+        <w:t xml:space="preserve">Рисунок </w:t>
+      </w:r>
+      <w:r>
+        <w:rPr>
+          <w:b w:val="0"/>
+        </w:rPr>
+        <w:t>9</w:t>
+      </w:r>
+      <w:r>
+        <w:rPr>
+          <w:b w:val="0"/>
+        </w:rPr>
+        <w:t xml:space="preserve"> </w:t>
+      </w:r>
+      <w:r>
+        <w:rPr>
+          <w:b w:val="0"/>
+        </w:rPr>
+        <w:t>–</w:t>
+      </w:r>
+      <w:r>
+        <w:rPr>
+          <w:b w:val="0"/>
+        </w:rPr>
+        <w:t xml:space="preserve"> Прохождение алгоритмом поиска в ширину </w:t>
+      </w:r>
+      <w:r>
+        <w:rPr>
+          <w:b w:val="0"/>
+        </w:rPr>
+        <w:t>средних уникальных</w:t>
+      </w:r>
+      <w:r>
+        <w:rPr>
+          <w:b w:val="0"/>
+        </w:rPr>
+        <w:t xml:space="preserve"> (первый с конфетами, а второй с призраками)</w:t>
+      </w:r>
+      <w:r>
+        <w:rPr>
+          <w:b w:val="0"/>
+        </w:rPr>
+        <w:t xml:space="preserve"> лабиринта</w:t>
+      </w:r>
+    </w:p>
+    <w:p>
+      <w:pPr>
+        <w:pStyle w:val="a5"/>
+        <w:rPr>
+          <w:b w:val="0"/>
+        </w:rPr>
+      </w:pPr>
+    </w:p>
+    <w:p>
+      <w:pPr>
+        <w:pStyle w:val="a5"/>
+        <w:rPr>
+          <w:b w:val="0"/>
+        </w:rPr>
+      </w:pPr>
+      <w:r>
+        <w:rPr>
+          <w:b w:val="0"/>
+        </w:rPr>
+        <w:drawing>
+          <wp:inline distT="0" distB="0" distL="0" distR="0" wp14:anchorId="2EB85CA6" wp14:editId="42408F6B">
+            <wp:extent cx="5940425" cy="2642870"/>
+            <wp:effectExtent l="0" t="0" r="3175" b="5080"/>
+            <wp:docPr id="1967221759" name="Рисунок 1"/>
+            <wp:cNvGraphicFramePr>
+              <a:graphicFrameLocks xmlns:a="http://schemas.openxmlformats.org/drawingml/2006/main" noChangeAspect="1"/>
+            </wp:cNvGraphicFramePr>
+            <a:graphic xmlns:a="http://schemas.openxmlformats.org/drawingml/2006/main">
+              <a:graphicData uri="http://schemas.openxmlformats.org/drawingml/2006/picture">
+                <pic:pic xmlns:pic="http://schemas.openxmlformats.org/drawingml/2006/picture">
+                  <pic:nvPicPr>
+                    <pic:cNvPr id="1967221759" name=""/>
+                    <pic:cNvPicPr/>
+                  </pic:nvPicPr>
+                  <pic:blipFill>
+                    <a:blip r:embed="rId14"/>
+                    <a:stretch>
+                      <a:fillRect/>
+                    </a:stretch>
+                  </pic:blipFill>
+                  <pic:spPr>
+                    <a:xfrm>
+                      <a:off x="0" y="0"/>
+                      <a:ext cx="5940425" cy="2642870"/>
+                    </a:xfrm>
+                    <a:prstGeom prst="rect">
+                      <a:avLst/>
+                    </a:prstGeom>
+                  </pic:spPr>
+                </pic:pic>
+              </a:graphicData>
+            </a:graphic>
+          </wp:inline>
+        </w:drawing>
+      </w:r>
+    </w:p>
+    <w:p>
+      <w:pPr>
+        <w:pStyle w:val="a5"/>
+        <w:rPr>
+          <w:b w:val="0"/>
+        </w:rPr>
+      </w:pPr>
+      <w:r>
+        <w:rPr>
+          <w:b w:val="0"/>
+        </w:rPr>
+        <w:t xml:space="preserve">Рисунок </w:t>
+      </w:r>
+      <w:r>
+        <w:rPr>
+          <w:b w:val="0"/>
+        </w:rPr>
+        <w:t>10</w:t>
+      </w:r>
+      <w:r>
+        <w:rPr>
+          <w:b w:val="0"/>
+        </w:rPr>
+        <w:t xml:space="preserve"> </w:t>
+      </w:r>
+      <w:r>
+        <w:rPr>
+          <w:b w:val="0"/>
+        </w:rPr>
+        <w:t>–</w:t>
+      </w:r>
+      <w:r>
+        <w:rPr>
+          <w:b w:val="0"/>
+        </w:rPr>
+        <w:t xml:space="preserve"> Прохождение авто оценщика для алгоритма поиска </w:t>
+      </w:r>
+      <w:r>
+        <w:rPr>
+          <w:b w:val="0"/>
+        </w:rPr>
+        <w:t>по весам</w:t>
+      </w:r>
+    </w:p>
+    <w:p>
+      <w:pPr>
+        <w:pStyle w:val="a5"/>
+        <w:rPr>
+          <w:b w:val="0"/>
+        </w:rPr>
+      </w:pPr>
+    </w:p>
+    <w:p>
+      <w:pPr>
+        <w:pStyle w:val="a5"/>
+      </w:pPr>
       <w:r>
         <w:t>Вывод</w:t>
       </w:r>
-      <w:r>
-        <w:t>:</w:t>
+    </w:p>
+    <w:p>
+      <w:pPr>
+        <w:ind w:firstLine="0"/>
+      </w:pPr>
+    </w:p>
+    <w:p>
+      <w:r>
+        <w:t xml:space="preserve">В ходе данной лабораторной работы были исследованы неинформированные методы поиска решений задач в пространстве состояний, </w:t>
+      </w:r>
+      <w:r>
+        <w:lastRenderedPageBreak/>
+        <w:t>приобретены навык</w:t>
+      </w:r>
+      <w:r>
+        <w:t>и</w:t>
+      </w:r>
+      <w:r>
+        <w:t xml:space="preserve"> программирования интеллектуальных агентов, планирующих действия на основе методов слепого поиска решений задач.</w:t>
       </w:r>
     </w:p>
     <w:p>
@@ -115,7 +3498,7 @@
 </file>
 
 <file path=word/numbering.xml><?xml version="1.0" encoding="utf-8"?>
-<w:numbering xmlns:wpc="http://schemas.microsoft.com/office/word/2010/wordprocessingCanvas" xmlns:cx="http://schemas.microsoft.com/office/drawing/2014/chartex" xmlns:cx1="http://schemas.microsoft.com/office/drawing/2015/9/8/chartex" xmlns:cx2="http://schemas.microsoft.com/office/drawing/2015/10/21/chartex" xmlns:cx3="http://schemas.microsoft.com/office/drawing/2016/5/9/chartex" xmlns:cx4="http://schemas.microsoft.com/office/drawing/2016/5/10/chartex" xmlns:cx5="http://schemas.microsoft.com/office/drawing/2016/5/11/chartex" xmlns:cx6="http://schemas.microsoft.com/office/drawing/2016/5/12/chartex" xmlns:cx7="http://schemas.microsoft.com/office/drawing/2016/5/13/chartex" xmlns:cx8="http://schemas.microsoft.com/office/drawing/2016/5/14/chartex" xmlns:mc="http://schemas.openxmlformats.org/markup-compatibility/2006" xmlns:aink="http://schemas.microsoft.com/office/drawing/2016/ink" xmlns:am3d="http://schemas.microsoft.com/office/drawing/2017/model3d" xmlns:o="urn:schemas-microsoft-com:office:office" xmlns:r="http://schemas.openxmlformats.org/officeDocument/2006/relationships" xmlns:m="http://schemas.openxmlformats.org/officeDocument/2006/math" xmlns:v="urn:schemas-microsoft-com:vml" xmlns:wp14="http://schemas.microsoft.com/office/word/2010/wordprocessingDrawing" xmlns:wp="http://schemas.openxmlformats.org/drawingml/2006/wordprocessingDrawing" xmlns:w10="urn:schemas-microsoft-com:office:word" xmlns:w="http://schemas.openxmlformats.org/wordprocessingml/2006/main" xmlns:w14="http://schemas.microsoft.com/office/word/2010/wordml" xmlns:w15="http://schemas.microsoft.com/office/word/2012/wordml" xmlns:w16cex="http://schemas.microsoft.com/office/word/2018/wordml/cex" xmlns:w16cid="http://schemas.microsoft.com/office/word/2016/wordml/cid" xmlns:w16="http://schemas.microsoft.com/office/word/2018/wordml" xmlns:w16sdtdh="http://schemas.microsoft.com/office/word/2020/wordml/sdtdatahash" xmlns:w16se="http://schemas.microsoft.com/office/word/2015/wordml/symex" xmlns:wpg="http://schemas.microsoft.com/office/word/2010/wordprocessingGroup" xmlns:wpi="http://schemas.microsoft.com/office/word/2010/wordprocessingInk" xmlns:wne="http://schemas.microsoft.com/office/word/2006/wordml" xmlns:wps="http://schemas.microsoft.com/office/word/2010/wordprocessingShape" mc:Ignorable="w14 w15 w16se w16cid w16 w16cex w16sdtdh wp14">
+<w:numbering xmlns:wpc="http://schemas.microsoft.com/office/word/2010/wordprocessingCanvas" xmlns:cx="http://schemas.microsoft.com/office/drawing/2014/chartex" xmlns:cx1="http://schemas.microsoft.com/office/drawing/2015/9/8/chartex" xmlns:cx2="http://schemas.microsoft.com/office/drawing/2015/10/21/chartex" xmlns:cx3="http://schemas.microsoft.com/office/drawing/2016/5/9/chartex" xmlns:cx4="http://schemas.microsoft.com/office/drawing/2016/5/10/chartex" xmlns:cx5="http://schemas.microsoft.com/office/drawing/2016/5/11/chartex" xmlns:cx6="http://schemas.microsoft.com/office/drawing/2016/5/12/chartex" xmlns:cx7="http://schemas.microsoft.com/office/drawing/2016/5/13/chartex" xmlns:cx8="http://schemas.microsoft.com/office/drawing/2016/5/14/chartex" xmlns:mc="http://schemas.openxmlformats.org/markup-compatibility/2006" xmlns:aink="http://schemas.microsoft.com/office/drawing/2016/ink" xmlns:am3d="http://schemas.microsoft.com/office/drawing/2017/model3d" xmlns:o="urn:schemas-microsoft-com:office:office" xmlns:oel="http://schemas.microsoft.com/office/2019/extlst" xmlns:r="http://schemas.openxmlformats.org/officeDocument/2006/relationships" xmlns:m="http://schemas.openxmlformats.org/officeDocument/2006/math" xmlns:v="urn:schemas-microsoft-com:vml" xmlns:wp14="http://schemas.microsoft.com/office/word/2010/wordprocessingDrawing" xmlns:wp="http://schemas.openxmlformats.org/drawingml/2006/wordprocessingDrawing" xmlns:w10="urn:schemas-microsoft-com:office:word" xmlns:w="http://schemas.openxmlformats.org/wordprocessingml/2006/main" xmlns:w14="http://schemas.microsoft.com/office/word/2010/wordml" xmlns:w15="http://schemas.microsoft.com/office/word/2012/wordml" xmlns:w16cex="http://schemas.microsoft.com/office/word/2018/wordml/cex" xmlns:w16cid="http://schemas.microsoft.com/office/word/2016/wordml/cid" xmlns:w16="http://schemas.microsoft.com/office/word/2018/wordml" xmlns:w16du="http://schemas.microsoft.com/office/word/2023/wordml/word16du" xmlns:w16sdtdh="http://schemas.microsoft.com/office/word/2020/wordml/sdtdatahash" xmlns:w16sdtfl="http://schemas.microsoft.com/office/word/2024/wordml/sdtformatlock" xmlns:w16se="http://schemas.microsoft.com/office/word/2015/wordml/symex" xmlns:wpg="http://schemas.microsoft.com/office/word/2010/wordprocessingGroup" xmlns:wpi="http://schemas.microsoft.com/office/word/2010/wordprocessingInk" xmlns:wne="http://schemas.microsoft.com/office/word/2006/wordml" xmlns:wps="http://schemas.microsoft.com/office/word/2010/wordprocessingShape" mc:Ignorable="w14 w15 w16se w16cid w16 w16cex w16sdtdh w16sdtfl w16du wp14">
   <w:abstractNum w:abstractNumId="0" w15:restartNumberingAfterBreak="0">
     <w:nsid w:val="6DB804A6"/>
     <w:multiLevelType w:val="hybridMultilevel"/>
@@ -228,14 +3611,14 @@
       </w:rPr>
     </w:lvl>
   </w:abstractNum>
-  <w:num w:numId="1">
+  <w:num w:numId="1" w16cid:durableId="135145359">
     <w:abstractNumId w:val="0"/>
   </w:num>
 </w:numbering>
 </file>
 
 <file path=word/styles.xml><?xml version="1.0" encoding="utf-8"?>
-<w:styles xmlns:mc="http://schemas.openxmlformats.org/markup-compatibility/2006" xmlns:r="http://schemas.openxmlformats.org/officeDocument/2006/relationships" xmlns:w="http://schemas.openxmlformats.org/wordprocessingml/2006/main" xmlns:w14="http://schemas.microsoft.com/office/word/2010/wordml" xmlns:w15="http://schemas.microsoft.com/office/word/2012/wordml" xmlns:w16cex="http://schemas.microsoft.com/office/word/2018/wordml/cex" xmlns:w16cid="http://schemas.microsoft.com/office/word/2016/wordml/cid" xmlns:w16="http://schemas.microsoft.com/office/word/2018/wordml" xmlns:w16sdtdh="http://schemas.microsoft.com/office/word/2020/wordml/sdtdatahash" xmlns:w16se="http://schemas.microsoft.com/office/word/2015/wordml/symex" mc:Ignorable="w14 w15 w16se w16cid w16 w16cex w16sdtdh">
+<w:styles xmlns:mc="http://schemas.openxmlformats.org/markup-compatibility/2006" xmlns:r="http://schemas.openxmlformats.org/officeDocument/2006/relationships" xmlns:w="http://schemas.openxmlformats.org/wordprocessingml/2006/main" xmlns:w14="http://schemas.microsoft.com/office/word/2010/wordml" xmlns:w15="http://schemas.microsoft.com/office/word/2012/wordml" xmlns:w16cex="http://schemas.microsoft.com/office/word/2018/wordml/cex" xmlns:w16cid="http://schemas.microsoft.com/office/word/2016/wordml/cid" xmlns:w16="http://schemas.microsoft.com/office/word/2018/wordml" xmlns:w16du="http://schemas.microsoft.com/office/word/2023/wordml/word16du" xmlns:w16sdtdh="http://schemas.microsoft.com/office/word/2020/wordml/sdtdatahash" xmlns:w16sdtfl="http://schemas.microsoft.com/office/word/2024/wordml/sdtformatlock" xmlns:w16se="http://schemas.microsoft.com/office/word/2015/wordml/symex" mc:Ignorable="w14 w15 w16se w16cid w16 w16cex w16sdtdh w16sdtfl w16du">
   <w:docDefaults>
     <w:rPrDefault>
       <w:rPr>

</xml_diff>